<commit_message>
test: complete AtomicBot controlled retest workbook
</commit_message>
<xml_diff>
--- a/docs/testing/workbooks/generated/02_AtomicBot_TurboQuant_Controlled_Retest_Workbook_v1.docx
+++ b/docs/testing/workbooks/generated/02_AtomicBot_TurboQuant_Controlled_Retest_Workbook_v1.docx
@@ -8,7 +8,7 @@
         <w:jc w:val="center"/>
       </w:pPr>
       <w:r>
-        <w:t>02 AtomicBot TurboQuant Controlled Retest Workbook v1.2</w:t>
+        <w:t>02 AtomicBot TurboQuant Controlled Retest Workbook v1.3</w:t>
       </w:r>
     </w:p>
     <w:p>
@@ -546,6 +546,137 @@
           <w:tcPr>
             <w:tcW w:type="dxa" w:w="2078"/>
             <w:vAlign w:val="center"/>
+          </w:tcPr>
+          <w:p>
+            <w:pPr>
+              <w:spacing w:after="0"/>
+            </w:pPr>
+            <w:r>
+              <w:rPr>
+                <w:sz w:val="14"/>
+              </w:rPr>
+              <w:t>Superseded</w:t>
+            </w:r>
+          </w:p>
+        </w:tc>
+      </w:tr>
+      <w:tr>
+        <w:trPr>
+          <w:cantSplit/>
+        </w:trPr>
+        <w:tc>
+          <w:tcPr>
+            <w:tcW w:type="dxa" w:w="2078"/>
+            <w:vAlign w:val="center"/>
+            <w:shd w:fill="EAF2F8"/>
+          </w:tcPr>
+          <w:p>
+            <w:pPr>
+              <w:spacing w:after="0"/>
+            </w:pPr>
+            <w:r>
+              <w:rPr>
+                <w:sz w:val="14"/>
+              </w:rPr>
+              <w:t>1.3</w:t>
+            </w:r>
+          </w:p>
+        </w:tc>
+        <w:tc>
+          <w:tcPr>
+            <w:tcW w:type="dxa" w:w="2078"/>
+            <w:vAlign w:val="center"/>
+            <w:shd w:fill="EAF2F8"/>
+          </w:tcPr>
+          <w:p>
+            <w:pPr>
+              <w:spacing w:after="0"/>
+            </w:pPr>
+            <w:r>
+              <w:rPr>
+                <w:sz w:val="14"/>
+              </w:rPr>
+              <w:t>2026-07-16</w:t>
+            </w:r>
+          </w:p>
+        </w:tc>
+        <w:tc>
+          <w:tcPr>
+            <w:tcW w:type="dxa" w:w="2078"/>
+            <w:vAlign w:val="center"/>
+            <w:shd w:fill="EAF2F8"/>
+          </w:tcPr>
+          <w:p>
+            <w:pPr>
+              <w:spacing w:after="0"/>
+            </w:pPr>
+            <w:r>
+              <w:rPr>
+                <w:sz w:val="14"/>
+              </w:rPr>
+              <w:t>Student</w:t>
+            </w:r>
+          </w:p>
+        </w:tc>
+        <w:tc>
+          <w:tcPr>
+            <w:tcW w:type="dxa" w:w="2078"/>
+            <w:vAlign w:val="center"/>
+            <w:shd w:fill="EAF2F8"/>
+          </w:tcPr>
+          <w:p>
+            <w:pPr>
+              <w:spacing w:after="0"/>
+            </w:pPr>
+            <w:r>
+              <w:rPr>
+                <w:sz w:val="14"/>
+              </w:rPr>
+              <w:t>Completed fresh CPU and Vulkan builds, repository tests, 17 formal runtime rows, loaded-server RAM/KV/TTFT measurement, bounded perplexity and blinded Q8_0 versus turbo3 quality scoring; retained two safety-blocked rows and one Device Guard-blocked repository test.</w:t>
+            </w:r>
+          </w:p>
+        </w:tc>
+        <w:tc>
+          <w:tcPr>
+            <w:tcW w:type="dxa" w:w="2078"/>
+            <w:vAlign w:val="center"/>
+            <w:shd w:fill="EAF2F8"/>
+          </w:tcPr>
+          <w:p>
+            <w:pPr>
+              <w:spacing w:after="0"/>
+            </w:pPr>
+            <w:r>
+              <w:rPr>
+                <w:sz w:val="14"/>
+              </w:rPr>
+              <w:t>AB-B01-AB-B08; AB-01-AB-15M; P1-P6</w:t>
+            </w:r>
+          </w:p>
+        </w:tc>
+        <w:tc>
+          <w:tcPr>
+            <w:tcW w:type="dxa" w:w="2078"/>
+            <w:vAlign w:val="center"/>
+            <w:shd w:fill="EAF2F8"/>
+          </w:tcPr>
+          <w:p>
+            <w:pPr>
+              <w:spacing w:after="0"/>
+            </w:pPr>
+            <w:r>
+              <w:rPr>
+                <w:sz w:val="14"/>
+              </w:rPr>
+              <w:t>testing/atomicbot-turboquant-formal-retest; Pending PR; Pending merge</w:t>
+            </w:r>
+          </w:p>
+        </w:tc>
+        <w:tc>
+          <w:tcPr>
+            <w:tcW w:type="dxa" w:w="2078"/>
+            <w:vAlign w:val="center"/>
+            <w:shd w:fill="EAF2F8"/>
           </w:tcPr>
           <w:p>
             <w:pPr>
@@ -641,7 +772,7 @@
         <w:spacing w:after="60"/>
       </w:pPr>
       <w:r>
-        <w:t>Controlled retest template v1.2. Historical results were removed from this working copy; the original source document is preserved under docs/testing/source-material/original-workbooks/.</w:t>
+        <w:t>Controlled retest template v1.3. Historical results were removed from this working copy; the original source document is preserved under docs/testing/source-material/original-workbooks/.</w:t>
       </w:r>
     </w:p>
     <w:p>
@@ -794,6 +925,7 @@
               <w:rPr>
                 <w:sz w:val="14"/>
               </w:rPr>
+              <w:t>Detached exact-commit checkout (remote default branch tip at acquisition)</w:t>
             </w:r>
           </w:p>
         </w:tc>
@@ -832,6 +964,7 @@
               <w:rPr>
                 <w:sz w:val="14"/>
               </w:rPr>
+              <w:t>`519f0c594a8e31467d2e2f2cf17054c9e7e11536`</w:t>
             </w:r>
           </w:p>
         </w:tc>
@@ -872,6 +1005,7 @@
               <w:rPr>
                 <w:sz w:val="14"/>
               </w:rPr>
+              <w:t>Not published as a single derivable base commit at the tested pin; source audit retained instead</w:t>
             </w:r>
           </w:p>
         </w:tc>
@@ -910,6 +1044,7 @@
               <w:rPr>
                 <w:sz w:val="14"/>
               </w:rPr>
+              <w:t>KV: `turbo2`, `turbo3`, `turbo4`; source also exposes TQ3_1S/TQ4_1S weight types</w:t>
             </w:r>
           </w:p>
         </w:tc>
@@ -950,6 +1085,7 @@
               <w:rPr>
                 <w:sz w:val="14"/>
               </w:rPr>
+              <w:t>Pass; reference CPU paths exercised</w:t>
             </w:r>
           </w:p>
         </w:tc>
@@ -988,6 +1124,7 @@
               <w:rPr>
                 <w:sz w:val="14"/>
               </w:rPr>
+              <w:t>Pass with limitations; partial and full placement exercised on Intel UHD</w:t>
             </w:r>
           </w:p>
         </w:tc>
@@ -1028,6 +1165,7 @@
               <w:rPr>
                 <w:sz w:val="14"/>
               </w:rPr>
+              <w:t>Unsupported for a TurboQuant-specific route at this pin; generic SYCL source exists but no TQ-specific implementation evidence</w:t>
             </w:r>
           </w:p>
         </w:tc>
@@ -1066,6 +1204,7 @@
               <w:rPr>
                 <w:sz w:val="14"/>
               </w:rPr>
+              <w:t>AtomicBot fork commit `519f0c5`; MSVC 19.51; CMake 4.3.1; Ninja 1.13.2</w:t>
             </w:r>
           </w:p>
         </w:tc>
@@ -1106,6 +1245,7 @@
               <w:rPr>
                 <w:sz w:val="14"/>
               </w:rPr>
+              <w:t>Student with Codex-controlled harness</w:t>
             </w:r>
           </w:p>
         </w:tc>
@@ -1144,6 +1284,7 @@
               <w:rPr>
                 <w:sz w:val="14"/>
               </w:rPr>
+              <w:t>2026-07-16</w:t>
             </w:r>
           </w:p>
         </w:tc>
@@ -1184,6 +1325,7 @@
               <w:rPr>
                 <w:sz w:val="14"/>
               </w:rPr>
+              <w:t>2026-07-16</w:t>
             </w:r>
           </w:p>
         </w:tc>
@@ -1222,6 +1364,7 @@
               <w:rPr>
                 <w:sz w:val="14"/>
               </w:rPr>
+              <w:t>Accepted with limitations: 17 formal runtime rows passed; two guarded 8B rows blocked; one repository test blocked by Device Guard</w:t>
             </w:r>
           </w:p>
         </w:tc>
@@ -1360,6 +1503,7 @@
               <w:rPr>
                 <w:sz w:val="14"/>
               </w:rPr>
+              <w:t>Confirmed</w:t>
             </w:r>
           </w:p>
         </w:tc>
@@ -1418,6 +1562,7 @@
               <w:rPr>
                 <w:sz w:val="14"/>
               </w:rPr>
+              <w:t>Confirmed; 12 logical processors</w:t>
             </w:r>
           </w:p>
         </w:tc>
@@ -1473,6 +1618,7 @@
               <w:rPr>
                 <w:sz w:val="14"/>
               </w:rPr>
+              <w:t>Confirmed; shared-memory safety gates enforced</w:t>
             </w:r>
           </w:p>
         </w:tc>
@@ -1531,6 +1677,7 @@
               <w:rPr>
                 <w:sz w:val="14"/>
               </w:rPr>
+              <w:t>Confirmed as Vulkan0</w:t>
             </w:r>
           </w:p>
         </w:tc>
@@ -1586,6 +1733,7 @@
               <w:rPr>
                 <w:sz w:val="14"/>
               </w:rPr>
+              <w:t>Confirmed; Windows build reported as 10.0.26200</w:t>
             </w:r>
           </w:p>
         </w:tc>
@@ -1644,6 +1792,7 @@
               <w:rPr>
                 <w:sz w:val="14"/>
               </w:rPr>
+              <w:t>Confirmed; N/A</w:t>
             </w:r>
           </w:p>
         </w:tc>
@@ -1800,6 +1949,7 @@
               <w:rPr>
                 <w:sz w:val="14"/>
               </w:rPr>
+              <w:t>Pass</w:t>
             </w:r>
           </w:p>
         </w:tc>
@@ -1816,6 +1966,7 @@
               <w:rPr>
                 <w:sz w:val="14"/>
               </w:rPr>
+              <w:t>Clean detached checkout and origin verified in `acquisition/results/AtomicBot_Environment_Manifest.json`</w:t>
             </w:r>
           </w:p>
         </w:tc>
@@ -1874,6 +2025,7 @@
               <w:rPr>
                 <w:sz w:val="14"/>
               </w:rPr>
+              <w:t>Pass</w:t>
             </w:r>
           </w:p>
         </w:tc>
@@ -1891,6 +2043,7 @@
               <w:rPr>
                 <w:sz w:val="14"/>
               </w:rPr>
+              <w:t>Fresh build root `C:/Users/Student/ab-retest-20260716/cpu`; UI bundle repair copied the pinned `loading.html` into generated build output only</w:t>
             </w:r>
           </w:p>
         </w:tc>
@@ -1946,6 +2099,7 @@
               <w:rPr>
                 <w:sz w:val="14"/>
               </w:rPr>
+              <w:t>Pass</w:t>
             </w:r>
           </w:p>
         </w:tc>
@@ -1962,6 +2116,7 @@
               <w:rPr>
                 <w:sz w:val="14"/>
               </w:rPr>
+              <w:t>`llama-cli`, `llama-server`, `llama-perplexity` and test binaries built; hashes retained in `acquisition/results/AtomicBot_cpu_Binary_Hashes.json`</w:t>
             </w:r>
           </w:p>
         </w:tc>
@@ -2020,6 +2175,7 @@
               <w:rPr>
                 <w:sz w:val="14"/>
               </w:rPr>
+              <w:t>Blocked/partial</w:t>
             </w:r>
           </w:p>
         </w:tc>
@@ -2037,6 +2193,7 @@
               <w:rPr>
                 <w:sz w:val="14"/>
               </w:rPr>
+              <w:t>42/43 effective passes after installing Jinja2 3.1.6; `test-barrier.exe` blocked by Windows Device Guard (exit 4551), not a product assertion failure</w:t>
             </w:r>
           </w:p>
         </w:tc>
@@ -2092,6 +2249,7 @@
               <w:rPr>
                 <w:sz w:val="14"/>
               </w:rPr>
+              <w:t>Pass</w:t>
             </w:r>
           </w:p>
         </w:tc>
@@ -2108,6 +2266,7 @@
               <w:rPr>
                 <w:sz w:val="14"/>
               </w:rPr>
+              <w:t>Fresh Vulkan build plus runtime placement evidence; Vulkan SDK 1.4.350.0</w:t>
             </w:r>
           </w:p>
         </w:tc>
@@ -2166,6 +2325,7 @@
               <w:rPr>
                 <w:sz w:val="14"/>
               </w:rPr>
+              <w:t>Unsupported</w:t>
             </w:r>
           </w:p>
         </w:tc>
@@ -2183,6 +2343,7 @@
               <w:rPr>
                 <w:sz w:val="14"/>
               </w:rPr>
+              <w:t>No TurboQuant-specific SYCL implementation evidence at pin; generic SYCL presence is not counted as TQ support</w:t>
             </w:r>
           </w:p>
         </w:tc>
@@ -2238,6 +2399,7 @@
               <w:rPr>
                 <w:sz w:val="14"/>
               </w:rPr>
+              <w:t>Pass</w:t>
             </w:r>
           </w:p>
         </w:tc>
@@ -2254,6 +2416,7 @@
               <w:rPr>
                 <w:sz w:val="14"/>
               </w:rPr>
+              <w:t>`-ctk/-ctv` accepted and runtime allocations prove `turbo2/3/4` activation</w:t>
             </w:r>
           </w:p>
         </w:tc>
@@ -2312,6 +2475,7 @@
               <w:rPr>
                 <w:sz w:val="14"/>
               </w:rPr>
+              <w:t>Pass</w:t>
             </w:r>
           </w:p>
         </w:tc>
@@ -2329,6 +2493,7 @@
               <w:rPr>
                 <w:sz w:val="14"/>
               </w:rPr>
+              <w:t>Shared-memory gates, missing GPU utilisation counter, hybrid placement and Device Guard limitation recorded</w:t>
             </w:r>
           </w:p>
         </w:tc>
@@ -2939,6 +3104,7 @@
               <w:rPr>
                 <w:sz w:val="14"/>
               </w:rPr>
+              <w:t>Pass</w:t>
             </w:r>
           </w:p>
         </w:tc>
@@ -3069,6 +3235,7 @@
               <w:rPr>
                 <w:sz w:val="14"/>
               </w:rPr>
+              <w:t>Pass</w:t>
             </w:r>
           </w:p>
         </w:tc>
@@ -3192,6 +3359,7 @@
               <w:rPr>
                 <w:sz w:val="14"/>
               </w:rPr>
+              <w:t>Pass</w:t>
             </w:r>
           </w:p>
         </w:tc>
@@ -3322,6 +3490,7 @@
               <w:rPr>
                 <w:sz w:val="14"/>
               </w:rPr>
+              <w:t>Pass</w:t>
             </w:r>
           </w:p>
         </w:tc>
@@ -3445,6 +3614,7 @@
               <w:rPr>
                 <w:sz w:val="14"/>
               </w:rPr>
+              <w:t>Pass</w:t>
             </w:r>
           </w:p>
         </w:tc>
@@ -3575,6 +3745,7 @@
               <w:rPr>
                 <w:sz w:val="14"/>
               </w:rPr>
+              <w:t>Pass</w:t>
             </w:r>
           </w:p>
         </w:tc>
@@ -3698,6 +3869,7 @@
               <w:rPr>
                 <w:sz w:val="14"/>
               </w:rPr>
+              <w:t>Pass</w:t>
             </w:r>
           </w:p>
         </w:tc>
@@ -3828,6 +4000,7 @@
               <w:rPr>
                 <w:sz w:val="14"/>
               </w:rPr>
+              <w:t>Pass</w:t>
             </w:r>
           </w:p>
         </w:tc>
@@ -3951,6 +4124,7 @@
               <w:rPr>
                 <w:sz w:val="14"/>
               </w:rPr>
+              <w:t>Pass</w:t>
             </w:r>
           </w:p>
         </w:tc>
@@ -4081,6 +4255,7 @@
               <w:rPr>
                 <w:sz w:val="14"/>
               </w:rPr>
+              <w:t>Blocked - safety gate</w:t>
             </w:r>
           </w:p>
         </w:tc>
@@ -4204,6 +4379,7 @@
               <w:rPr>
                 <w:sz w:val="14"/>
               </w:rPr>
+              <w:t>Pass after isolated rerun</w:t>
             </w:r>
           </w:p>
         </w:tc>
@@ -4334,6 +4510,7 @@
               <w:rPr>
                 <w:sz w:val="14"/>
               </w:rPr>
+              <w:t>Pass</w:t>
             </w:r>
           </w:p>
         </w:tc>
@@ -4457,6 +4634,7 @@
               <w:rPr>
                 <w:sz w:val="14"/>
               </w:rPr>
+              <w:t>Pass</w:t>
             </w:r>
           </w:p>
         </w:tc>
@@ -4587,6 +4765,7 @@
               <w:rPr>
                 <w:sz w:val="14"/>
               </w:rPr>
+              <w:t>Pass</w:t>
             </w:r>
           </w:p>
         </w:tc>
@@ -4710,6 +4889,7 @@
               <w:rPr>
                 <w:sz w:val="14"/>
               </w:rPr>
+              <w:t>Pass; hybrid</w:t>
             </w:r>
           </w:p>
         </w:tc>
@@ -4840,6 +5020,7 @@
               <w:rPr>
                 <w:sz w:val="14"/>
               </w:rPr>
+              <w:t>Pass; 41/41 layers</w:t>
             </w:r>
           </w:p>
         </w:tc>
@@ -4963,6 +5144,7 @@
               <w:rPr>
                 <w:sz w:val="14"/>
               </w:rPr>
+              <w:t>Pass; hybrid</w:t>
             </w:r>
           </w:p>
         </w:tc>
@@ -5093,6 +5275,7 @@
               <w:rPr>
                 <w:sz w:val="14"/>
               </w:rPr>
+              <w:t>Pass; hybrid</w:t>
             </w:r>
           </w:p>
         </w:tc>
@@ -5216,6 +5399,7 @@
               <w:rPr>
                 <w:sz w:val="14"/>
               </w:rPr>
+              <w:t>Blocked - safety gate</w:t>
             </w:r>
           </w:p>
         </w:tc>
@@ -5485,6 +5669,7 @@
               <w:rPr>
                 <w:sz w:val="14"/>
               </w:rPr>
+              <w:t>Yes</w:t>
             </w:r>
           </w:p>
         </w:tc>
@@ -5501,6 +5686,7 @@
               <w:rPr>
                 <w:sz w:val="14"/>
               </w:rPr>
+              <w:t>Yes</w:t>
             </w:r>
           </w:p>
         </w:tc>
@@ -5613,6 +5799,7 @@
               <w:rPr>
                 <w:sz w:val="14"/>
               </w:rPr>
+              <w:t>Yes</w:t>
             </w:r>
           </w:p>
         </w:tc>
@@ -5630,6 +5817,7 @@
               <w:rPr>
                 <w:sz w:val="14"/>
               </w:rPr>
+              <w:t>Yes</w:t>
             </w:r>
           </w:p>
         </w:tc>
@@ -5736,6 +5924,7 @@
               <w:rPr>
                 <w:sz w:val="14"/>
               </w:rPr>
+              <w:t>Yes</w:t>
             </w:r>
           </w:p>
         </w:tc>
@@ -5752,6 +5941,7 @@
               <w:rPr>
                 <w:sz w:val="14"/>
               </w:rPr>
+              <w:t>Yes</w:t>
             </w:r>
           </w:p>
         </w:tc>
@@ -5864,6 +6054,7 @@
               <w:rPr>
                 <w:sz w:val="14"/>
               </w:rPr>
+              <w:t>Yes</w:t>
             </w:r>
           </w:p>
         </w:tc>
@@ -5881,6 +6072,7 @@
               <w:rPr>
                 <w:sz w:val="14"/>
               </w:rPr>
+              <w:t>Yes</w:t>
             </w:r>
           </w:p>
         </w:tc>
@@ -5987,6 +6179,7 @@
               <w:rPr>
                 <w:sz w:val="14"/>
               </w:rPr>
+              <w:t>Yes</w:t>
             </w:r>
           </w:p>
         </w:tc>
@@ -6003,6 +6196,7 @@
               <w:rPr>
                 <w:sz w:val="14"/>
               </w:rPr>
+              <w:t>Yes</w:t>
             </w:r>
           </w:p>
         </w:tc>
@@ -6115,6 +6309,7 @@
               <w:rPr>
                 <w:sz w:val="14"/>
               </w:rPr>
+              <w:t>Yes</w:t>
             </w:r>
           </w:p>
         </w:tc>
@@ -6132,6 +6327,7 @@
               <w:rPr>
                 <w:sz w:val="14"/>
               </w:rPr>
+              <w:t>Yes, partial 3B</w:t>
             </w:r>
           </w:p>
         </w:tc>
@@ -6238,6 +6434,7 @@
               <w:rPr>
                 <w:sz w:val="14"/>
               </w:rPr>
+              <w:t>Yes</w:t>
             </w:r>
           </w:p>
         </w:tc>
@@ -6254,6 +6451,7 @@
               <w:rPr>
                 <w:sz w:val="14"/>
               </w:rPr>
+              <w:t>Yes, partial and full 3B</w:t>
             </w:r>
           </w:p>
         </w:tc>
@@ -6366,6 +6564,7 @@
               <w:rPr>
                 <w:sz w:val="14"/>
               </w:rPr>
+              <w:t>Partial</w:t>
             </w:r>
           </w:p>
         </w:tc>
@@ -6383,6 +6582,7 @@
               <w:rPr>
                 <w:sz w:val="14"/>
               </w:rPr>
+              <w:t>Yes, partial only; full blocked</w:t>
             </w:r>
           </w:p>
         </w:tc>
@@ -6655,6 +6855,7 @@
               <w:rPr>
                 <w:sz w:val="14"/>
               </w:rPr>
+              <w:t>Intel UHD Vulkan0 + CPU</w:t>
             </w:r>
           </w:p>
         </w:tc>
@@ -6671,6 +6872,7 @@
               <w:rPr>
                 <w:sz w:val="14"/>
               </w:rPr>
+              <w:t>Vulkan hybrid</w:t>
             </w:r>
           </w:p>
         </w:tc>
@@ -6687,6 +6889,7 @@
               <w:rPr>
                 <w:sz w:val="14"/>
               </w:rPr>
+              <w:t>1/41 layers; 200.99 MiB model and 86.77 MiB compute buffers on Vulkan0</w:t>
             </w:r>
           </w:p>
         </w:tc>
@@ -6703,6 +6906,7 @@
               <w:rPr>
                 <w:sz w:val="14"/>
               </w:rPr>
+              <w:t>CPU, 320.00 MiB</w:t>
             </w:r>
           </w:p>
         </w:tc>
@@ -6719,6 +6923,7 @@
               <w:rPr>
                 <w:sz w:val="14"/>
               </w:rPr>
+              <w:t>Yes, intended hybrid</w:t>
             </w:r>
           </w:p>
         </w:tc>
@@ -6735,6 +6940,7 @@
               <w:rPr>
                 <w:sz w:val="14"/>
               </w:rPr>
+              <w:t>48.186 median</w:t>
             </w:r>
           </w:p>
         </w:tc>
@@ -6751,6 +6957,7 @@
               <w:rPr>
                 <w:sz w:val="14"/>
               </w:rPr>
+              <w:t>N/A - counter unavailable</w:t>
             </w:r>
           </w:p>
         </w:tc>
@@ -6767,6 +6974,7 @@
               <w:rPr>
                 <w:sz w:val="14"/>
               </w:rPr>
+              <w:t>`acquisition/results/AB-11/`</w:t>
             </w:r>
           </w:p>
         </w:tc>
@@ -6825,6 +7033,7 @@
               <w:rPr>
                 <w:sz w:val="14"/>
               </w:rPr>
+              <w:t>Intel UHD Vulkan0 + CPU</w:t>
             </w:r>
           </w:p>
         </w:tc>
@@ -6842,6 +7051,7 @@
               <w:rPr>
                 <w:sz w:val="14"/>
               </w:rPr>
+              <w:t>Vulkan hybrid</w:t>
             </w:r>
           </w:p>
         </w:tc>
@@ -6859,6 +7069,7 @@
               <w:rPr>
                 <w:sz w:val="14"/>
               </w:rPr>
+              <w:t>1/41 layers; 200.99 MiB model and 82.77 MiB compute buffers on Vulkan0</w:t>
             </w:r>
           </w:p>
         </w:tc>
@@ -6876,6 +7087,7 @@
               <w:rPr>
                 <w:sz w:val="14"/>
               </w:rPr>
+              <w:t>CPU, 125.13 MiB</w:t>
             </w:r>
           </w:p>
         </w:tc>
@@ -6893,6 +7105,7 @@
               <w:rPr>
                 <w:sz w:val="14"/>
               </w:rPr>
+              <w:t>Yes, intended hybrid</w:t>
             </w:r>
           </w:p>
         </w:tc>
@@ -6910,6 +7123,7 @@
               <w:rPr>
                 <w:sz w:val="14"/>
               </w:rPr>
+              <w:t>58.765 median</w:t>
             </w:r>
           </w:p>
         </w:tc>
@@ -6927,6 +7141,7 @@
               <w:rPr>
                 <w:sz w:val="14"/>
               </w:rPr>
+              <w:t>N/A - counter unavailable</w:t>
             </w:r>
           </w:p>
         </w:tc>
@@ -6944,6 +7159,7 @@
               <w:rPr>
                 <w:sz w:val="14"/>
               </w:rPr>
+              <w:t>`acquisition/results/AB-12/`</w:t>
             </w:r>
           </w:p>
         </w:tc>
@@ -6999,6 +7215,7 @@
               <w:rPr>
                 <w:sz w:val="14"/>
               </w:rPr>
+              <w:t>Intel UHD Vulkan0</w:t>
             </w:r>
           </w:p>
         </w:tc>
@@ -7015,6 +7232,7 @@
               <w:rPr>
                 <w:sz w:val="14"/>
               </w:rPr>
+              <w:t>Vulkan native placement</w:t>
             </w:r>
           </w:p>
         </w:tc>
@@ -7031,6 +7249,7 @@
               <w:rPr>
                 <w:sz w:val="14"/>
               </w:rPr>
+              <w:t>41/41 layers; 1998.84 MiB model and 62.01 MiB compute buffers on Vulkan0</w:t>
             </w:r>
           </w:p>
         </w:tc>
@@ -7047,6 +7266,7 @@
               <w:rPr>
                 <w:sz w:val="14"/>
               </w:rPr>
+              <w:t>Vulkan0, 125.13 MiB</w:t>
             </w:r>
           </w:p>
         </w:tc>
@@ -7063,6 +7283,7 @@
               <w:rPr>
                 <w:sz w:val="14"/>
               </w:rPr>
+              <w:t>No unexplained fallback</w:t>
             </w:r>
           </w:p>
         </w:tc>
@@ -7079,6 +7300,7 @@
               <w:rPr>
                 <w:sz w:val="14"/>
               </w:rPr>
+              <w:t>2.651 median</w:t>
             </w:r>
           </w:p>
         </w:tc>
@@ -7095,6 +7317,7 @@
               <w:rPr>
                 <w:sz w:val="14"/>
               </w:rPr>
+              <w:t>N/A - counter unavailable</w:t>
             </w:r>
           </w:p>
         </w:tc>
@@ -7111,6 +7334,7 @@
               <w:rPr>
                 <w:sz w:val="14"/>
               </w:rPr>
+              <w:t>`acquisition/results/AB-13/`</w:t>
             </w:r>
           </w:p>
         </w:tc>
@@ -7169,6 +7393,7 @@
               <w:rPr>
                 <w:sz w:val="14"/>
               </w:rPr>
+              <w:t>Intel UHD Vulkan0 + CPU</w:t>
             </w:r>
           </w:p>
         </w:tc>
@@ -7186,6 +7411,7 @@
               <w:rPr>
                 <w:sz w:val="14"/>
               </w:rPr>
+              <w:t>Vulkan hybrid</w:t>
             </w:r>
           </w:p>
         </w:tc>
@@ -7203,6 +7429,7 @@
               <w:rPr>
                 <w:sz w:val="14"/>
               </w:rPr>
+              <w:t>1/41 layers; 321.58 MiB model and 111.38 MiB compute buffers on Vulkan0</w:t>
             </w:r>
           </w:p>
         </w:tc>
@@ -7220,6 +7447,7 @@
               <w:rPr>
                 <w:sz w:val="14"/>
               </w:rPr>
+              <w:t>CPU, 340.00 MiB</w:t>
             </w:r>
           </w:p>
         </w:tc>
@@ -7237,6 +7465,7 @@
               <w:rPr>
                 <w:sz w:val="14"/>
               </w:rPr>
+              <w:t>Yes, intended hybrid</w:t>
             </w:r>
           </w:p>
         </w:tc>
@@ -7254,6 +7483,7 @@
               <w:rPr>
                 <w:sz w:val="14"/>
               </w:rPr>
+              <w:t>50.446 median</w:t>
             </w:r>
           </w:p>
         </w:tc>
@@ -7271,6 +7501,7 @@
               <w:rPr>
                 <w:sz w:val="14"/>
               </w:rPr>
+              <w:t>N/A - counter unavailable</w:t>
             </w:r>
           </w:p>
         </w:tc>
@@ -7288,6 +7519,7 @@
               <w:rPr>
                 <w:sz w:val="14"/>
               </w:rPr>
+              <w:t>`acquisition/results/AB-14/`</w:t>
             </w:r>
           </w:p>
         </w:tc>
@@ -7343,6 +7575,7 @@
               <w:rPr>
                 <w:sz w:val="14"/>
               </w:rPr>
+              <w:t>Intel UHD Vulkan0 + CPU</w:t>
             </w:r>
           </w:p>
         </w:tc>
@@ -7359,6 +7592,7 @@
               <w:rPr>
                 <w:sz w:val="14"/>
               </w:rPr>
+              <w:t>Vulkan hybrid</w:t>
             </w:r>
           </w:p>
         </w:tc>
@@ -7375,6 +7609,7 @@
               <w:rPr>
                 <w:sz w:val="14"/>
               </w:rPr>
+              <w:t>1/41 layers; 321.58 MiB model and 120.13 MiB compute buffers on Vulkan0</w:t>
             </w:r>
           </w:p>
         </w:tc>
@@ -7391,6 +7626,7 @@
               <w:rPr>
                 <w:sz w:val="14"/>
               </w:rPr>
+              <w:t>CPU, 125.13 MiB</w:t>
             </w:r>
           </w:p>
         </w:tc>
@@ -7407,6 +7643,7 @@
               <w:rPr>
                 <w:sz w:val="14"/>
               </w:rPr>
+              <w:t>Yes, intended hybrid</w:t>
             </w:r>
           </w:p>
         </w:tc>
@@ -7423,6 +7660,7 @@
               <w:rPr>
                 <w:sz w:val="14"/>
               </w:rPr>
+              <w:t>49.173 median</w:t>
             </w:r>
           </w:p>
         </w:tc>
@@ -7439,6 +7677,7 @@
               <w:rPr>
                 <w:sz w:val="14"/>
               </w:rPr>
+              <w:t>N/A - counter unavailable</w:t>
             </w:r>
           </w:p>
         </w:tc>
@@ -7455,6 +7694,7 @@
               <w:rPr>
                 <w:sz w:val="14"/>
               </w:rPr>
+              <w:t>`acquisition/results/AB-15/`</w:t>
             </w:r>
           </w:p>
         </w:tc>
@@ -7513,6 +7753,7 @@
               <w:rPr>
                 <w:sz w:val="14"/>
               </w:rPr>
+              <w:t>Not run</w:t>
             </w:r>
           </w:p>
         </w:tc>
@@ -7530,6 +7771,7 @@
               <w:rPr>
                 <w:sz w:val="14"/>
               </w:rPr>
+              <w:t>Blocked</w:t>
             </w:r>
           </w:p>
         </w:tc>
@@ -7547,6 +7789,7 @@
               <w:rPr>
                 <w:sz w:val="14"/>
               </w:rPr>
+              <w:t>N/A; 16 GB shared-memory safety gate</w:t>
             </w:r>
           </w:p>
         </w:tc>
@@ -7564,6 +7807,7 @@
               <w:rPr>
                 <w:sz w:val="14"/>
               </w:rPr>
+              <w:t>N/A - blocked</w:t>
             </w:r>
           </w:p>
         </w:tc>
@@ -7581,6 +7825,7 @@
               <w:rPr>
                 <w:sz w:val="14"/>
               </w:rPr>
+              <w:t>N/A - blocked</w:t>
             </w:r>
           </w:p>
         </w:tc>
@@ -7598,6 +7843,7 @@
               <w:rPr>
                 <w:sz w:val="14"/>
               </w:rPr>
+              <w:t>N/A - blocked</w:t>
             </w:r>
           </w:p>
         </w:tc>
@@ -7615,6 +7861,7 @@
               <w:rPr>
                 <w:sz w:val="14"/>
               </w:rPr>
+              <w:t>N/A - blocked</w:t>
             </w:r>
           </w:p>
         </w:tc>
@@ -7632,6 +7879,7 @@
               <w:rPr>
                 <w:sz w:val="14"/>
               </w:rPr>
+              <w:t>`acquisition/results/AtomicBot_Master_Summary.json`</w:t>
             </w:r>
           </w:p>
         </w:tc>
@@ -8043,6 +8291,7 @@
               <w:rPr>
                 <w:sz w:val="14"/>
               </w:rPr>
+              <w:t>923.949</w:t>
             </w:r>
           </w:p>
         </w:tc>
@@ -8059,6 +8308,7 @@
               <w:rPr>
                 <w:sz w:val="14"/>
               </w:rPr>
+              <w:t>26.00</w:t>
             </w:r>
           </w:p>
         </w:tc>
@@ -8075,6 +8325,7 @@
               <w:rPr>
                 <w:sz w:val="14"/>
               </w:rPr>
+              <w:t>110.562</w:t>
             </w:r>
           </w:p>
         </w:tc>
@@ -8091,6 +8342,7 @@
               <w:rPr>
                 <w:sz w:val="14"/>
               </w:rPr>
+              <w:t>37.50</w:t>
             </w:r>
           </w:p>
         </w:tc>
@@ -8107,6 +8359,7 @@
               <w:rPr>
                 <w:sz w:val="14"/>
               </w:rPr>
+              <w:t>N/A - diagnostic not quality-screened</w:t>
             </w:r>
           </w:p>
         </w:tc>
@@ -8123,6 +8376,7 @@
               <w:rPr>
                 <w:sz w:val="14"/>
               </w:rPr>
+              <w:t>Pass</w:t>
             </w:r>
           </w:p>
         </w:tc>
@@ -8271,6 +8525,7 @@
               <w:rPr>
                 <w:sz w:val="14"/>
               </w:rPr>
+              <w:t>903.688</w:t>
             </w:r>
           </w:p>
         </w:tc>
@@ -8288,6 +8543,7 @@
               <w:rPr>
                 <w:sz w:val="14"/>
               </w:rPr>
+              <w:t>5.08</w:t>
             </w:r>
           </w:p>
         </w:tc>
@@ -8305,6 +8561,7 @@
               <w:rPr>
                 <w:sz w:val="14"/>
               </w:rPr>
+              <w:t>81.053</w:t>
             </w:r>
           </w:p>
         </w:tc>
@@ -8322,6 +8579,7 @@
               <w:rPr>
                 <w:sz w:val="14"/>
               </w:rPr>
+              <w:t>30.80</w:t>
             </w:r>
           </w:p>
         </w:tc>
@@ -8339,6 +8597,7 @@
               <w:rPr>
                 <w:sz w:val="14"/>
               </w:rPr>
+              <w:t>N/A - diagnostic not quality-screened</w:t>
             </w:r>
           </w:p>
         </w:tc>
@@ -8356,6 +8615,7 @@
               <w:rPr>
                 <w:sz w:val="14"/>
               </w:rPr>
+              <w:t>Pass</w:t>
             </w:r>
           </w:p>
         </w:tc>
@@ -8496,6 +8756,7 @@
               <w:rPr>
                 <w:sz w:val="14"/>
               </w:rPr>
+              <w:t>3657.688</w:t>
             </w:r>
           </w:p>
         </w:tc>
@@ -8512,6 +8773,7 @@
               <w:rPr>
                 <w:sz w:val="14"/>
               </w:rPr>
+              <w:t>160.00</w:t>
             </w:r>
           </w:p>
         </w:tc>
@@ -8528,6 +8790,7 @@
               <w:rPr>
                 <w:sz w:val="14"/>
               </w:rPr>
+              <w:t>118.903</w:t>
             </w:r>
           </w:p>
         </w:tc>
@@ -8544,6 +8807,7 @@
               <w:rPr>
                 <w:sz w:val="14"/>
               </w:rPr>
+              <w:t>15.90</w:t>
             </w:r>
           </w:p>
         </w:tc>
@@ -8560,6 +8824,7 @@
               <w:rPr>
                 <w:sz w:val="14"/>
               </w:rPr>
+              <w:t>N/A - unmatched quality config</w:t>
             </w:r>
           </w:p>
         </w:tc>
@@ -8576,6 +8841,7 @@
               <w:rPr>
                 <w:sz w:val="14"/>
               </w:rPr>
+              <w:t>Pass</w:t>
             </w:r>
           </w:p>
         </w:tc>
@@ -8724,6 +8990,7 @@
               <w:rPr>
                 <w:sz w:val="14"/>
               </w:rPr>
+              <w:t>3818.957</w:t>
             </w:r>
           </w:p>
         </w:tc>
@@ -8741,6 +9008,7 @@
               <w:rPr>
                 <w:sz w:val="14"/>
               </w:rPr>
+              <w:t>320.00</w:t>
             </w:r>
           </w:p>
         </w:tc>
@@ -8758,6 +9026,7 @@
               <w:rPr>
                 <w:sz w:val="14"/>
               </w:rPr>
+              <w:t>144.610</w:t>
             </w:r>
           </w:p>
         </w:tc>
@@ -8775,6 +9044,7 @@
               <w:rPr>
                 <w:sz w:val="14"/>
               </w:rPr>
+              <w:t>15.10</w:t>
             </w:r>
           </w:p>
         </w:tc>
@@ -8792,6 +9062,7 @@
               <w:rPr>
                 <w:sz w:val="14"/>
               </w:rPr>
+              <w:t>N/A - quality baseline is Q8_0</w:t>
             </w:r>
           </w:p>
         </w:tc>
@@ -8809,6 +9080,7 @@
               <w:rPr>
                 <w:sz w:val="14"/>
               </w:rPr>
+              <w:t>Pass</w:t>
             </w:r>
           </w:p>
         </w:tc>
@@ -8949,6 +9221,7 @@
               <w:rPr>
                 <w:sz w:val="14"/>
               </w:rPr>
+              <w:t>3668.938</w:t>
             </w:r>
           </w:p>
         </w:tc>
@@ -8965,6 +9238,7 @@
               <w:rPr>
                 <w:sz w:val="14"/>
               </w:rPr>
+              <w:t>170.00</w:t>
             </w:r>
           </w:p>
         </w:tc>
@@ -8981,6 +9255,7 @@
               <w:rPr>
                 <w:sz w:val="14"/>
               </w:rPr>
+              <w:t>134.316</w:t>
             </w:r>
           </w:p>
         </w:tc>
@@ -8997,6 +9272,7 @@
               <w:rPr>
                 <w:sz w:val="14"/>
               </w:rPr>
+              <w:t>15.90</w:t>
             </w:r>
           </w:p>
         </w:tc>
@@ -9013,6 +9289,7 @@
               <w:rPr>
                 <w:sz w:val="14"/>
               </w:rPr>
+              <w:t>6.67</w:t>
             </w:r>
           </w:p>
         </w:tc>
@@ -9029,6 +9306,7 @@
               <w:rPr>
                 <w:sz w:val="14"/>
               </w:rPr>
+              <w:t>Pass</w:t>
             </w:r>
           </w:p>
         </w:tc>
@@ -9177,6 +9455,7 @@
               <w:rPr>
                 <w:sz w:val="14"/>
               </w:rPr>
+              <w:t>3669.125</w:t>
             </w:r>
           </w:p>
         </w:tc>
@@ -9194,6 +9473,7 @@
               <w:rPr>
                 <w:sz w:val="14"/>
               </w:rPr>
+              <w:t>170.00</w:t>
             </w:r>
           </w:p>
         </w:tc>
@@ -9211,6 +9491,7 @@
               <w:rPr>
                 <w:sz w:val="14"/>
               </w:rPr>
+              <w:t>166.100</w:t>
             </w:r>
           </w:p>
         </w:tc>
@@ -9228,6 +9509,7 @@
               <w:rPr>
                 <w:sz w:val="14"/>
               </w:rPr>
+              <w:t>11.80</w:t>
             </w:r>
           </w:p>
         </w:tc>
@@ -9245,6 +9527,7 @@
               <w:rPr>
                 <w:sz w:val="14"/>
               </w:rPr>
+              <w:t>N/A - not quality-screened</w:t>
             </w:r>
           </w:p>
         </w:tc>
@@ -9262,6 +9545,7 @@
               <w:rPr>
                 <w:sz w:val="14"/>
               </w:rPr>
+              <w:t>Pass</w:t>
             </w:r>
           </w:p>
         </w:tc>
@@ -9402,6 +9686,7 @@
               <w:rPr>
                 <w:sz w:val="14"/>
               </w:rPr>
+              <w:t>3624.750</w:t>
             </w:r>
           </w:p>
         </w:tc>
@@ -9418,6 +9703,7 @@
               <w:rPr>
                 <w:sz w:val="14"/>
               </w:rPr>
+              <w:t>125.00</w:t>
             </w:r>
           </w:p>
         </w:tc>
@@ -9434,6 +9720,7 @@
               <w:rPr>
                 <w:sz w:val="14"/>
               </w:rPr>
+              <w:t>137.405</w:t>
             </w:r>
           </w:p>
         </w:tc>
@@ -9450,6 +9737,7 @@
               <w:rPr>
                 <w:sz w:val="14"/>
               </w:rPr>
+              <w:t>11.80</w:t>
             </w:r>
           </w:p>
         </w:tc>
@@ -9466,6 +9754,7 @@
               <w:rPr>
                 <w:sz w:val="14"/>
               </w:rPr>
+              <w:t>6.64</w:t>
             </w:r>
           </w:p>
         </w:tc>
@@ -9482,6 +9771,7 @@
               <w:rPr>
                 <w:sz w:val="14"/>
               </w:rPr>
+              <w:t>Pass; quality limitation</w:t>
             </w:r>
           </w:p>
         </w:tc>
@@ -9630,6 +9920,7 @@
               <w:rPr>
                 <w:sz w:val="14"/>
               </w:rPr>
+              <w:t>3588.754</w:t>
             </w:r>
           </w:p>
         </w:tc>
@@ -9647,6 +9938,7 @@
               <w:rPr>
                 <w:sz w:val="14"/>
               </w:rPr>
+              <w:t>89.25</w:t>
             </w:r>
           </w:p>
         </w:tc>
@@ -9664,6 +9956,7 @@
               <w:rPr>
                 <w:sz w:val="14"/>
               </w:rPr>
+              <w:t>150.086</w:t>
             </w:r>
           </w:p>
         </w:tc>
@@ -9681,6 +9974,7 @@
               <w:rPr>
                 <w:sz w:val="14"/>
               </w:rPr>
+              <w:t>13.10</w:t>
             </w:r>
           </w:p>
         </w:tc>
@@ -9698,6 +9992,7 @@
               <w:rPr>
                 <w:sz w:val="14"/>
               </w:rPr>
+              <w:t>N/A - not quality-screened</w:t>
             </w:r>
           </w:p>
         </w:tc>
@@ -9715,6 +10010,7 @@
               <w:rPr>
                 <w:sz w:val="14"/>
               </w:rPr>
+              <w:t>Pass</w:t>
             </w:r>
           </w:p>
         </w:tc>
@@ -9855,6 +10151,7 @@
               <w:rPr>
                 <w:sz w:val="14"/>
               </w:rPr>
+              <w:t>8914.633</w:t>
             </w:r>
           </w:p>
         </w:tc>
@@ -9871,6 +10168,7 @@
               <w:rPr>
                 <w:sz w:val="14"/>
               </w:rPr>
+              <w:t>320.00</w:t>
             </w:r>
           </w:p>
         </w:tc>
@@ -9887,6 +10185,7 @@
               <w:rPr>
                 <w:sz w:val="14"/>
               </w:rPr>
+              <w:t>459.308</w:t>
             </w:r>
           </w:p>
         </w:tc>
@@ -9903,6 +10202,7 @@
               <w:rPr>
                 <w:sz w:val="14"/>
               </w:rPr>
+              <w:t>6.80</w:t>
             </w:r>
           </w:p>
         </w:tc>
@@ -9919,6 +10219,7 @@
               <w:rPr>
                 <w:sz w:val="14"/>
               </w:rPr>
+              <w:t>N/A - not quality-screened</w:t>
             </w:r>
           </w:p>
         </w:tc>
@@ -9935,6 +10236,7 @@
               <w:rPr>
                 <w:sz w:val="14"/>
               </w:rPr>
+              <w:t>Pass</w:t>
             </w:r>
           </w:p>
         </w:tc>
@@ -10083,6 +10385,7 @@
               <w:rPr>
                 <w:sz w:val="14"/>
               </w:rPr>
+              <w:t>Blocked</w:t>
             </w:r>
           </w:p>
         </w:tc>
@@ -10100,6 +10403,7 @@
               <w:rPr>
                 <w:sz w:val="14"/>
               </w:rPr>
+              <w:t>Blocked</w:t>
             </w:r>
           </w:p>
         </w:tc>
@@ -10117,6 +10421,7 @@
               <w:rPr>
                 <w:sz w:val="14"/>
               </w:rPr>
+              <w:t>Blocked</w:t>
             </w:r>
           </w:p>
         </w:tc>
@@ -10134,6 +10439,7 @@
               <w:rPr>
                 <w:sz w:val="14"/>
               </w:rPr>
+              <w:t>Blocked</w:t>
             </w:r>
           </w:p>
         </w:tc>
@@ -10151,6 +10457,7 @@
               <w:rPr>
                 <w:sz w:val="14"/>
               </w:rPr>
+              <w:t>N/A - safety gate</w:t>
             </w:r>
           </w:p>
         </w:tc>
@@ -10168,6 +10475,7 @@
               <w:rPr>
                 <w:sz w:val="14"/>
               </w:rPr>
+              <w:t>Blocked - memory gate</w:t>
             </w:r>
           </w:p>
         </w:tc>
@@ -10308,6 +10616,7 @@
               <w:rPr>
                 <w:sz w:val="14"/>
               </w:rPr>
+              <w:t>8934.840</w:t>
             </w:r>
           </w:p>
         </w:tc>
@@ -10324,6 +10633,7 @@
               <w:rPr>
                 <w:sz w:val="14"/>
               </w:rPr>
+              <w:t>340.00</w:t>
             </w:r>
           </w:p>
         </w:tc>
@@ -10340,6 +10650,7 @@
               <w:rPr>
                 <w:sz w:val="14"/>
               </w:rPr>
+              <w:t>540.412</w:t>
             </w:r>
           </w:p>
         </w:tc>
@@ -10356,6 +10667,7 @@
               <w:rPr>
                 <w:sz w:val="14"/>
               </w:rPr>
+              <w:t>6.80</w:t>
             </w:r>
           </w:p>
         </w:tc>
@@ -10372,6 +10684,7 @@
               <w:rPr>
                 <w:sz w:val="14"/>
               </w:rPr>
+              <w:t>N/A - not quality-screened</w:t>
             </w:r>
           </w:p>
         </w:tc>
@@ -10388,6 +10701,7 @@
               <w:rPr>
                 <w:sz w:val="14"/>
               </w:rPr>
+              <w:t>Pass after isolated rerun</w:t>
             </w:r>
           </w:p>
         </w:tc>
@@ -10536,6 +10850,7 @@
               <w:rPr>
                 <w:sz w:val="14"/>
               </w:rPr>
+              <w:t>8767.055</w:t>
             </w:r>
           </w:p>
         </w:tc>
@@ -10553,6 +10868,7 @@
               <w:rPr>
                 <w:sz w:val="14"/>
               </w:rPr>
+              <w:t>170.00</w:t>
             </w:r>
           </w:p>
         </w:tc>
@@ -10570,6 +10886,7 @@
               <w:rPr>
                 <w:sz w:val="14"/>
               </w:rPr>
+              <w:t>332.794</w:t>
             </w:r>
           </w:p>
         </w:tc>
@@ -10587,6 +10904,7 @@
               <w:rPr>
                 <w:sz w:val="14"/>
               </w:rPr>
+              <w:t>5.90</w:t>
             </w:r>
           </w:p>
         </w:tc>
@@ -10604,6 +10922,7 @@
               <w:rPr>
                 <w:sz w:val="14"/>
               </w:rPr>
+              <w:t>N/A - not quality-screened</w:t>
             </w:r>
           </w:p>
         </w:tc>
@@ -10621,6 +10940,7 @@
               <w:rPr>
                 <w:sz w:val="14"/>
               </w:rPr>
+              <w:t>Pass</w:t>
             </w:r>
           </w:p>
         </w:tc>
@@ -10761,6 +11081,7 @@
               <w:rPr>
                 <w:sz w:val="14"/>
               </w:rPr>
+              <w:t>8720.383</w:t>
             </w:r>
           </w:p>
         </w:tc>
@@ -10777,6 +11098,7 @@
               <w:rPr>
                 <w:sz w:val="14"/>
               </w:rPr>
+              <w:t>125.00</w:t>
             </w:r>
           </w:p>
         </w:tc>
@@ -10793,6 +11115,7 @@
               <w:rPr>
                 <w:sz w:val="14"/>
               </w:rPr>
+              <w:t>339.918</w:t>
             </w:r>
           </w:p>
         </w:tc>
@@ -10809,6 +11132,7 @@
               <w:rPr>
                 <w:sz w:val="14"/>
               </w:rPr>
+              <w:t>5.90</w:t>
             </w:r>
           </w:p>
         </w:tc>
@@ -10825,6 +11149,7 @@
               <w:rPr>
                 <w:sz w:val="14"/>
               </w:rPr>
+              <w:t>N/A - not quality-screened</w:t>
             </w:r>
           </w:p>
         </w:tc>
@@ -10841,6 +11166,7 @@
               <w:rPr>
                 <w:sz w:val="14"/>
               </w:rPr>
+              <w:t>Pass</w:t>
             </w:r>
           </w:p>
         </w:tc>
@@ -10989,6 +11315,7 @@
               <w:rPr>
                 <w:sz w:val="14"/>
               </w:rPr>
+              <w:t>2903.941</w:t>
             </w:r>
           </w:p>
         </w:tc>
@@ -11006,6 +11333,7 @@
               <w:rPr>
                 <w:sz w:val="14"/>
               </w:rPr>
+              <w:t>320.00</w:t>
             </w:r>
           </w:p>
         </w:tc>
@@ -11023,6 +11351,7 @@
               <w:rPr>
                 <w:sz w:val="14"/>
               </w:rPr>
+              <w:t>203.267</w:t>
             </w:r>
           </w:p>
         </w:tc>
@@ -11040,6 +11369,7 @@
               <w:rPr>
                 <w:sz w:val="14"/>
               </w:rPr>
+              <w:t>14.00</w:t>
             </w:r>
           </w:p>
         </w:tc>
@@ -11057,6 +11387,7 @@
               <w:rPr>
                 <w:sz w:val="14"/>
               </w:rPr>
+              <w:t>N/A - not quality-screened</w:t>
             </w:r>
           </w:p>
         </w:tc>
@@ -11074,6 +11405,7 @@
               <w:rPr>
                 <w:sz w:val="14"/>
               </w:rPr>
+              <w:t>Pass</w:t>
             </w:r>
           </w:p>
         </w:tc>
@@ -11214,6 +11546,7 @@
               <w:rPr>
                 <w:sz w:val="14"/>
               </w:rPr>
+              <w:t>2705.563</w:t>
             </w:r>
           </w:p>
         </w:tc>
@@ -11230,6 +11563,7 @@
               <w:rPr>
                 <w:sz w:val="14"/>
               </w:rPr>
+              <w:t>125.00</w:t>
             </w:r>
           </w:p>
         </w:tc>
@@ -11246,6 +11580,7 @@
               <w:rPr>
                 <w:sz w:val="14"/>
               </w:rPr>
+              <w:t>224.509</w:t>
             </w:r>
           </w:p>
         </w:tc>
@@ -11262,6 +11597,7 @@
               <w:rPr>
                 <w:sz w:val="14"/>
               </w:rPr>
+              <w:t>9.60</w:t>
             </w:r>
           </w:p>
         </w:tc>
@@ -11278,6 +11614,7 @@
               <w:rPr>
                 <w:sz w:val="14"/>
               </w:rPr>
+              <w:t>N/A - device differs from quality route</w:t>
             </w:r>
           </w:p>
         </w:tc>
@@ -11294,6 +11631,7 @@
               <w:rPr>
                 <w:sz w:val="14"/>
               </w:rPr>
+              <w:t>Pass</w:t>
             </w:r>
           </w:p>
         </w:tc>
@@ -11442,6 +11780,7 @@
               <w:rPr>
                 <w:sz w:val="14"/>
               </w:rPr>
+              <w:t>4541.016</w:t>
             </w:r>
           </w:p>
         </w:tc>
@@ -11459,6 +11798,7 @@
               <w:rPr>
                 <w:sz w:val="14"/>
               </w:rPr>
+              <w:t>125.00</w:t>
             </w:r>
           </w:p>
         </w:tc>
@@ -11476,6 +11816,7 @@
               <w:rPr>
                 <w:sz w:val="14"/>
               </w:rPr>
+              <w:t>410.507</w:t>
             </w:r>
           </w:p>
         </w:tc>
@@ -11493,6 +11834,7 @@
               <w:rPr>
                 <w:sz w:val="14"/>
               </w:rPr>
+              <w:t>7.60</w:t>
             </w:r>
           </w:p>
         </w:tc>
@@ -11510,6 +11852,7 @@
               <w:rPr>
                 <w:sz w:val="14"/>
               </w:rPr>
+              <w:t>N/A - device differs from quality route</w:t>
             </w:r>
           </w:p>
         </w:tc>
@@ -11527,6 +11870,7 @@
               <w:rPr>
                 <w:sz w:val="14"/>
               </w:rPr>
+              <w:t>Pass</w:t>
             </w:r>
           </w:p>
         </w:tc>
@@ -11667,6 +12011,7 @@
               <w:rPr>
                 <w:sz w:val="14"/>
               </w:rPr>
+              <w:t>6073.473</w:t>
             </w:r>
           </w:p>
         </w:tc>
@@ -11683,6 +12028,7 @@
               <w:rPr>
                 <w:sz w:val="14"/>
               </w:rPr>
+              <w:t>340.00</w:t>
             </w:r>
           </w:p>
         </w:tc>
@@ -11699,6 +12045,7 @@
               <w:rPr>
                 <w:sz w:val="14"/>
               </w:rPr>
+              <w:t>639.484</w:t>
             </w:r>
           </w:p>
         </w:tc>
@@ -11715,6 +12062,7 @@
               <w:rPr>
                 <w:sz w:val="14"/>
               </w:rPr>
+              <w:t>6.00</w:t>
             </w:r>
           </w:p>
         </w:tc>
@@ -11731,6 +12079,7 @@
               <w:rPr>
                 <w:sz w:val="14"/>
               </w:rPr>
+              <w:t>N/A - not quality-screened</w:t>
             </w:r>
           </w:p>
         </w:tc>
@@ -11747,6 +12096,7 @@
               <w:rPr>
                 <w:sz w:val="14"/>
               </w:rPr>
+              <w:t>Pass</w:t>
             </w:r>
           </w:p>
         </w:tc>
@@ -11895,6 +12245,7 @@
               <w:rPr>
                 <w:sz w:val="14"/>
               </w:rPr>
+              <w:t>5868.852</w:t>
             </w:r>
           </w:p>
         </w:tc>
@@ -11912,6 +12263,7 @@
               <w:rPr>
                 <w:sz w:val="14"/>
               </w:rPr>
+              <w:t>125.00</w:t>
             </w:r>
           </w:p>
         </w:tc>
@@ -11929,6 +12281,7 @@
               <w:rPr>
                 <w:sz w:val="14"/>
               </w:rPr>
+              <w:t>504.813</w:t>
             </w:r>
           </w:p>
         </w:tc>
@@ -11946,6 +12299,7 @@
               <w:rPr>
                 <w:sz w:val="14"/>
               </w:rPr>
+              <w:t>5.40</w:t>
             </w:r>
           </w:p>
         </w:tc>
@@ -11963,6 +12317,7 @@
               <w:rPr>
                 <w:sz w:val="14"/>
               </w:rPr>
+              <w:t>N/A - not quality-screened</w:t>
             </w:r>
           </w:p>
         </w:tc>
@@ -11980,6 +12335,7 @@
               <w:rPr>
                 <w:sz w:val="14"/>
               </w:rPr>
+              <w:t>Pass</w:t>
             </w:r>
           </w:p>
         </w:tc>
@@ -12120,6 +12476,7 @@
               <w:rPr>
                 <w:sz w:val="14"/>
               </w:rPr>
+              <w:t>Blocked</w:t>
             </w:r>
           </w:p>
         </w:tc>
@@ -12136,6 +12493,7 @@
               <w:rPr>
                 <w:sz w:val="14"/>
               </w:rPr>
+              <w:t>Blocked</w:t>
             </w:r>
           </w:p>
         </w:tc>
@@ -12152,6 +12510,7 @@
               <w:rPr>
                 <w:sz w:val="14"/>
               </w:rPr>
+              <w:t>Blocked</w:t>
             </w:r>
           </w:p>
         </w:tc>
@@ -12168,6 +12527,7 @@
               <w:rPr>
                 <w:sz w:val="14"/>
               </w:rPr>
+              <w:t>Blocked</w:t>
             </w:r>
           </w:p>
         </w:tc>
@@ -12184,6 +12544,7 @@
               <w:rPr>
                 <w:sz w:val="14"/>
               </w:rPr>
+              <w:t>N/A - safety gate</w:t>
             </w:r>
           </w:p>
         </w:tc>
@@ -12200,6 +12561,7 @@
               <w:rPr>
                 <w:sz w:val="14"/>
               </w:rPr>
+              <w:t>Blocked - memory gate</w:t>
             </w:r>
           </w:p>
         </w:tc>
@@ -12375,6 +12737,7 @@
               <w:rPr>
                 <w:sz w:val="14"/>
               </w:rPr>
+              <w:t>26.00</w:t>
             </w:r>
           </w:p>
         </w:tc>
@@ -12391,6 +12754,7 @@
               <w:rPr>
                 <w:sz w:val="14"/>
               </w:rPr>
+              <w:t>5.08</w:t>
             </w:r>
           </w:p>
         </w:tc>
@@ -12407,6 +12771,7 @@
               <w:rPr>
                 <w:sz w:val="14"/>
               </w:rPr>
+              <w:t>5.118x</w:t>
             </w:r>
           </w:p>
         </w:tc>
@@ -12423,6 +12788,7 @@
               <w:rPr>
                 <w:sz w:val="14"/>
               </w:rPr>
+              <w:t>80.46%</w:t>
             </w:r>
           </w:p>
         </w:tc>
@@ -12439,6 +12805,7 @@
               <w:rPr>
                 <w:sz w:val="14"/>
               </w:rPr>
+              <w:t>Direct 1K matched allocation reduction versus F16</w:t>
             </w:r>
           </w:p>
         </w:tc>
@@ -12479,6 +12846,7 @@
               <w:rPr>
                 <w:sz w:val="14"/>
               </w:rPr>
+              <w:t>320.00</w:t>
             </w:r>
           </w:p>
         </w:tc>
@@ -12496,6 +12864,7 @@
               <w:rPr>
                 <w:sz w:val="14"/>
               </w:rPr>
+              <w:t>170.00</w:t>
             </w:r>
           </w:p>
         </w:tc>
@@ -12513,6 +12882,7 @@
               <w:rPr>
                 <w:sz w:val="14"/>
               </w:rPr>
+              <w:t>1.882x</w:t>
             </w:r>
           </w:p>
         </w:tc>
@@ -12530,6 +12900,7 @@
               <w:rPr>
                 <w:sz w:val="14"/>
               </w:rPr>
+              <w:t>46.88%</w:t>
             </w:r>
           </w:p>
         </w:tc>
@@ -12547,6 +12918,7 @@
               <w:rPr>
                 <w:sz w:val="14"/>
               </w:rPr>
+              <w:t>Direct matched 4K conventional baseline</w:t>
             </w:r>
           </w:p>
         </w:tc>
@@ -12585,6 +12957,7 @@
               <w:rPr>
                 <w:sz w:val="14"/>
               </w:rPr>
+              <w:t>320.00</w:t>
             </w:r>
           </w:p>
         </w:tc>
@@ -12601,6 +12974,7 @@
               <w:rPr>
                 <w:sz w:val="14"/>
               </w:rPr>
+              <w:t>170.00</w:t>
             </w:r>
           </w:p>
         </w:tc>
@@ -12617,6 +12991,7 @@
               <w:rPr>
                 <w:sz w:val="14"/>
               </w:rPr>
+              <w:t>1.882x</w:t>
             </w:r>
           </w:p>
         </w:tc>
@@ -12633,6 +13008,7 @@
               <w:rPr>
                 <w:sz w:val="14"/>
               </w:rPr>
+              <w:t>46.88%</w:t>
             </w:r>
           </w:p>
         </w:tc>
@@ -12649,6 +13025,7 @@
               <w:rPr>
                 <w:sz w:val="14"/>
               </w:rPr>
+              <w:t>Direct matched 4K allocation reduction; no advantage over Q8_0 here</w:t>
             </w:r>
           </w:p>
         </w:tc>
@@ -12689,6 +13066,7 @@
               <w:rPr>
                 <w:sz w:val="14"/>
               </w:rPr>
+              <w:t>320.00</w:t>
             </w:r>
           </w:p>
         </w:tc>
@@ -12706,6 +13084,7 @@
               <w:rPr>
                 <w:sz w:val="14"/>
               </w:rPr>
+              <w:t>125.00</w:t>
             </w:r>
           </w:p>
         </w:tc>
@@ -12723,6 +13102,7 @@
               <w:rPr>
                 <w:sz w:val="14"/>
               </w:rPr>
+              <w:t>2.560x</w:t>
             </w:r>
           </w:p>
         </w:tc>
@@ -12740,6 +13120,7 @@
               <w:rPr>
                 <w:sz w:val="14"/>
               </w:rPr>
+              <w:t>60.94%</w:t>
             </w:r>
           </w:p>
         </w:tc>
@@ -12757,6 +13138,7 @@
               <w:rPr>
                 <w:sz w:val="14"/>
               </w:rPr>
+              <w:t>Direct matched 4K allocation reduction; controlled quality score lower than Q8_0</w:t>
             </w:r>
           </w:p>
         </w:tc>
@@ -12795,6 +13177,7 @@
               <w:rPr>
                 <w:sz w:val="14"/>
               </w:rPr>
+              <w:t>320.00</w:t>
             </w:r>
           </w:p>
         </w:tc>
@@ -12811,6 +13194,7 @@
               <w:rPr>
                 <w:sz w:val="14"/>
               </w:rPr>
+              <w:t>89.25</w:t>
             </w:r>
           </w:p>
         </w:tc>
@@ -12827,6 +13211,7 @@
               <w:rPr>
                 <w:sz w:val="14"/>
               </w:rPr>
+              <w:t>3.585x</w:t>
             </w:r>
           </w:p>
         </w:tc>
@@ -12843,6 +13228,7 @@
               <w:rPr>
                 <w:sz w:val="14"/>
               </w:rPr>
+              <w:t>72.11%</w:t>
             </w:r>
           </w:p>
         </w:tc>
@@ -12859,6 +13245,7 @@
               <w:rPr>
                 <w:sz w:val="14"/>
               </w:rPr>
+              <w:t>Largest measured reduction; quality not evaluated in P1-P6 screen</w:t>
             </w:r>
           </w:p>
         </w:tc>
@@ -12899,6 +13286,7 @@
               <w:rPr>
                 <w:sz w:val="14"/>
               </w:rPr>
+              <w:t>Blocked</w:t>
             </w:r>
           </w:p>
         </w:tc>
@@ -12916,6 +13304,7 @@
               <w:rPr>
                 <w:sz w:val="14"/>
               </w:rPr>
+              <w:t>170.00</w:t>
             </w:r>
           </w:p>
         </w:tc>
@@ -12933,6 +13322,7 @@
               <w:rPr>
                 <w:sz w:val="14"/>
               </w:rPr>
+              <w:t>N/A</w:t>
             </w:r>
           </w:p>
         </w:tc>
@@ -12950,6 +13340,7 @@
               <w:rPr>
                 <w:sz w:val="14"/>
               </w:rPr>
+              <w:t>N/A</w:t>
             </w:r>
           </w:p>
         </w:tc>
@@ -12967,6 +13358,7 @@
               <w:rPr>
                 <w:sz w:val="14"/>
               </w:rPr>
+              <w:t>Matched 8B F16 4K reference blocked by safety gate; no ratio claimed</w:t>
             </w:r>
           </w:p>
         </w:tc>
@@ -13005,6 +13397,7 @@
               <w:rPr>
                 <w:sz w:val="14"/>
               </w:rPr>
+              <w:t>Blocked</w:t>
             </w:r>
           </w:p>
         </w:tc>
@@ -13021,6 +13414,7 @@
               <w:rPr>
                 <w:sz w:val="14"/>
               </w:rPr>
+              <w:t>125.00</w:t>
             </w:r>
           </w:p>
         </w:tc>
@@ -13037,6 +13431,7 @@
               <w:rPr>
                 <w:sz w:val="14"/>
               </w:rPr>
+              <w:t>N/A</w:t>
             </w:r>
           </w:p>
         </w:tc>
@@ -13053,6 +13448,7 @@
               <w:rPr>
                 <w:sz w:val="14"/>
               </w:rPr>
+              <w:t>N/A</w:t>
             </w:r>
           </w:p>
         </w:tc>
@@ -13069,6 +13465,7 @@
               <w:rPr>
                 <w:sz w:val="14"/>
               </w:rPr>
+              <w:t>Matched 8B F16 4K reference blocked by safety gate; no ratio claimed</w:t>
             </w:r>
           </w:p>
         </w:tc>
@@ -13200,6 +13597,7 @@
               <w:rPr>
                 <w:sz w:val="14"/>
               </w:rPr>
+              <w:t>1.0010</w:t>
             </w:r>
           </w:p>
         </w:tc>
@@ -13216,6 +13614,7 @@
               <w:rPr>
                 <w:sz w:val="14"/>
               </w:rPr>
+              <w:t>0</w:t>
             </w:r>
           </w:p>
         </w:tc>
@@ -13232,6 +13631,7 @@
               <w:rPr>
                 <w:sz w:val="14"/>
               </w:rPr>
+              <w:t>Synthetic regression corpus v1 only; not general perplexity evidence</w:t>
             </w:r>
           </w:p>
         </w:tc>
@@ -13272,6 +13672,7 @@
               <w:rPr>
                 <w:sz w:val="14"/>
               </w:rPr>
+              <w:t>1.0009</w:t>
             </w:r>
           </w:p>
         </w:tc>
@@ -13289,6 +13690,7 @@
               <w:rPr>
                 <w:sz w:val="14"/>
               </w:rPr>
+              <w:t>0</w:t>
             </w:r>
           </w:p>
         </w:tc>
@@ -13306,6 +13708,7 @@
               <w:rPr>
                 <w:sz w:val="14"/>
               </w:rPr>
+              <w:t>Synthetic regression corpus v1 only; delta is not a broad quality claim</w:t>
             </w:r>
           </w:p>
         </w:tc>
@@ -13344,6 +13747,7 @@
               <w:rPr>
                 <w:sz w:val="14"/>
               </w:rPr>
+              <w:t>1.0014</w:t>
             </w:r>
           </w:p>
         </w:tc>
@@ -13360,6 +13764,7 @@
               <w:rPr>
                 <w:sz w:val="14"/>
               </w:rPr>
+              <w:t>0</w:t>
             </w:r>
           </w:p>
         </w:tc>
@@ -13376,6 +13781,7 @@
               <w:rPr>
                 <w:sz w:val="14"/>
               </w:rPr>
+              <w:t>Synthetic regression corpus v1 only; narrow implementation check</w:t>
             </w:r>
           </w:p>
         </w:tc>
@@ -13416,6 +13822,7 @@
               <w:rPr>
                 <w:sz w:val="14"/>
               </w:rPr>
+              <w:t>1.0197</w:t>
             </w:r>
           </w:p>
         </w:tc>
@@ -13433,6 +13840,7 @@
               <w:rPr>
                 <w:sz w:val="14"/>
               </w:rPr>
+              <w:t>0</w:t>
             </w:r>
           </w:p>
         </w:tc>
@@ -13450,6 +13858,7 @@
               <w:rPr>
                 <w:sz w:val="14"/>
               </w:rPr>
+              <w:t>Synthetic regression corpus v1 only; narrow degradation signal</w:t>
             </w:r>
           </w:p>
         </w:tc>
@@ -13488,6 +13897,7 @@
               <w:rPr>
                 <w:sz w:val="14"/>
               </w:rPr>
+              <w:t>1.8613</w:t>
             </w:r>
           </w:p>
         </w:tc>
@@ -13504,6 +13914,7 @@
               <w:rPr>
                 <w:sz w:val="14"/>
               </w:rPr>
+              <w:t>0</w:t>
             </w:r>
           </w:p>
         </w:tc>
@@ -13520,6 +13931,7 @@
               <w:rPr>
                 <w:sz w:val="14"/>
               </w:rPr>
+              <w:t>Synthetic regression corpus v1 only; strong narrow degradation signal</w:t>
             </w:r>
           </w:p>
         </w:tc>
@@ -13756,6 +14168,7 @@
               <w:rPr>
                 <w:sz w:val="14"/>
               </w:rPr>
+              <w:t>4.00</w:t>
             </w:r>
           </w:p>
         </w:tc>
@@ -13772,6 +14185,7 @@
               <w:rPr>
                 <w:sz w:val="14"/>
               </w:rPr>
+              <w:t>9.00</w:t>
             </w:r>
           </w:p>
         </w:tc>
@@ -13788,6 +14202,7 @@
               <w:rPr>
                 <w:sz w:val="14"/>
               </w:rPr>
+              <w:t>Both: Yes</w:t>
             </w:r>
           </w:p>
         </w:tc>
@@ -13804,6 +14219,7 @@
               <w:rPr>
                 <w:sz w:val="14"/>
               </w:rPr>
+              <w:t>Baseline: No; optimised: Yes</w:t>
             </w:r>
           </w:p>
         </w:tc>
@@ -13820,6 +14236,7 @@
               <w:rPr>
                 <w:sz w:val="14"/>
               </w:rPr>
+              <w:t>No</w:t>
             </w:r>
           </w:p>
         </w:tc>
@@ -13836,6 +14253,7 @@
               <w:rPr>
                 <w:sz w:val="14"/>
               </w:rPr>
+              <w:t>Baseline supplies three benefits and only one limitation, so it is critically capped; optimised meets five bullets, 82 words, required terms and all semantic slots</w:t>
             </w:r>
           </w:p>
         </w:tc>
@@ -13894,6 +14312,7 @@
               <w:rPr>
                 <w:sz w:val="14"/>
               </w:rPr>
+              <w:t>8.00</w:t>
             </w:r>
           </w:p>
         </w:tc>
@@ -13911,6 +14330,7 @@
               <w:rPr>
                 <w:sz w:val="14"/>
               </w:rPr>
+              <w:t>8.10</w:t>
             </w:r>
           </w:p>
         </w:tc>
@@ -13928,6 +14348,7 @@
               <w:rPr>
                 <w:sz w:val="14"/>
               </w:rPr>
+              <w:t>Both: Yes</w:t>
             </w:r>
           </w:p>
         </w:tc>
@@ -13945,6 +14366,7 @@
               <w:rPr>
                 <w:sz w:val="14"/>
               </w:rPr>
+              <w:t>Both: Yes</w:t>
             </w:r>
           </w:p>
         </w:tc>
@@ -13962,6 +14384,7 @@
               <w:rPr>
                 <w:sz w:val="14"/>
               </w:rPr>
+              <w:t>No</w:t>
             </w:r>
           </w:p>
         </w:tc>
@@ -13979,6 +14402,7 @@
               <w:rPr>
                 <w:sz w:val="14"/>
               </w:rPr>
+              <w:t>Both have exactly three non-empty labelled lines; content is usable but verification wording is not perfect</w:t>
             </w:r>
           </w:p>
         </w:tc>
@@ -14034,6 +14458,7 @@
               <w:rPr>
                 <w:sz w:val="14"/>
               </w:rPr>
+              <w:t>4.00</w:t>
             </w:r>
           </w:p>
         </w:tc>
@@ -14050,6 +14475,7 @@
               <w:rPr>
                 <w:sz w:val="14"/>
               </w:rPr>
+              <w:t>8.75</w:t>
             </w:r>
           </w:p>
         </w:tc>
@@ -14066,6 +14492,7 @@
               <w:rPr>
                 <w:sz w:val="14"/>
               </w:rPr>
+              <w:t>Both: Yes</w:t>
             </w:r>
           </w:p>
         </w:tc>
@@ -14082,6 +14509,7 @@
               <w:rPr>
                 <w:sz w:val="14"/>
               </w:rPr>
+              <w:t>Baseline: No; optimised: Yes</w:t>
             </w:r>
           </w:p>
         </w:tc>
@@ -14098,6 +14526,7 @@
               <w:rPr>
                 <w:sz w:val="14"/>
               </w:rPr>
+              <w:t>No</w:t>
             </w:r>
           </w:p>
         </w:tc>
@@ -14114,6 +14543,7 @@
               <w:rPr>
                 <w:sz w:val="14"/>
               </w:rPr>
+              <w:t>Baseline's `memory_effect: Increased` materially contradicts the optimisation, imposing a 4/10 cap</w:t>
             </w:r>
           </w:p>
         </w:tc>
@@ -14172,6 +14602,7 @@
               <w:rPr>
                 <w:sz w:val="14"/>
               </w:rPr>
+              <w:t>10.00</w:t>
             </w:r>
           </w:p>
         </w:tc>
@@ -14189,6 +14620,7 @@
               <w:rPr>
                 <w:sz w:val="14"/>
               </w:rPr>
+              <w:t>4.00</w:t>
             </w:r>
           </w:p>
         </w:tc>
@@ -14206,6 +14638,7 @@
               <w:rPr>
                 <w:sz w:val="14"/>
               </w:rPr>
+              <w:t>Baseline: Yes; optimised: No</w:t>
             </w:r>
           </w:p>
         </w:tc>
@@ -14223,6 +14656,7 @@
               <w:rPr>
                 <w:sz w:val="14"/>
               </w:rPr>
+              <w:t>Baseline: Yes; optimised: No</w:t>
             </w:r>
           </w:p>
         </w:tc>
@@ -14240,6 +14674,7 @@
               <w:rPr>
                 <w:sz w:val="14"/>
               </w:rPr>
+              <w:t>No</w:t>
             </w:r>
           </w:p>
         </w:tc>
@@ -14257,6 +14692,7 @@
               <w:rPr>
                 <w:sz w:val="14"/>
               </w:rPr>
+              <w:t>Optimised emits one sentence, omits `upstream`, and collapses explicit K/V wording; critical cap applied</w:t>
             </w:r>
           </w:p>
         </w:tc>
@@ -14312,6 +14748,7 @@
               <w:rPr>
                 <w:sz w:val="14"/>
               </w:rPr>
+              <w:t>4.00</w:t>
             </w:r>
           </w:p>
         </w:tc>
@@ -14328,6 +14765,7 @@
               <w:rPr>
                 <w:sz w:val="14"/>
               </w:rPr>
+              <w:t>0.00</w:t>
             </w:r>
           </w:p>
         </w:tc>
@@ -14344,6 +14782,7 @@
               <w:rPr>
                 <w:sz w:val="14"/>
               </w:rPr>
+              <w:t>Baseline: No; optimised: No</w:t>
             </w:r>
           </w:p>
         </w:tc>
@@ -14360,6 +14799,7 @@
               <w:rPr>
                 <w:sz w:val="14"/>
               </w:rPr>
+              <w:t>Baseline: Yes; optimised: No</w:t>
             </w:r>
           </w:p>
         </w:tc>
@@ -14376,6 +14816,7 @@
               <w:rPr>
                 <w:sz w:val="14"/>
               </w:rPr>
+              <w:t>Optimised timed out</w:t>
             </w:r>
           </w:p>
         </w:tc>
@@ -14392,6 +14833,7 @@
               <w:rPr>
                 <w:sz w:val="14"/>
               </w:rPr>
+              <w:t>Baseline retrieved the right marker but inserted a prohibited space; Turbo3 returned no response within 2400 s at the required 8706-token prompt</w:t>
             </w:r>
           </w:p>
         </w:tc>
@@ -14450,6 +14892,7 @@
               <w:rPr>
                 <w:sz w:val="14"/>
               </w:rPr>
+              <w:t>10.00</w:t>
             </w:r>
           </w:p>
         </w:tc>
@@ -14467,6 +14910,7 @@
               <w:rPr>
                 <w:sz w:val="14"/>
               </w:rPr>
+              <w:t>10.00</w:t>
             </w:r>
           </w:p>
         </w:tc>
@@ -14484,6 +14928,7 @@
               <w:rPr>
                 <w:sz w:val="14"/>
               </w:rPr>
+              <w:t>Both: Yes</w:t>
             </w:r>
           </w:p>
         </w:tc>
@@ -14501,6 +14946,7 @@
               <w:rPr>
                 <w:sz w:val="14"/>
               </w:rPr>
+              <w:t>Both: Yes</w:t>
             </w:r>
           </w:p>
         </w:tc>
@@ -14518,6 +14964,7 @@
               <w:rPr>
                 <w:sz w:val="14"/>
               </w:rPr>
+              <w:t>No</w:t>
             </w:r>
           </w:p>
         </w:tc>
@@ -14535,6 +14982,7 @@
               <w:rPr>
                 <w:sz w:val="14"/>
               </w:rPr>
+              <w:t>Both returned `SAVED` then exact `amber:4821`</w:t>
             </w:r>
           </w:p>
         </w:tc>
@@ -14590,6 +15038,7 @@
               <w:rPr>
                 <w:sz w:val="14"/>
               </w:rPr>
+              <w:t>6.67</w:t>
             </w:r>
           </w:p>
         </w:tc>
@@ -14606,6 +15055,7 @@
               <w:rPr>
                 <w:sz w:val="14"/>
               </w:rPr>
+              <w:t>6.64</w:t>
             </w:r>
           </w:p>
         </w:tc>
@@ -14622,6 +15072,7 @@
               <w:rPr>
                 <w:sz w:val="14"/>
               </w:rPr>
+              <w:t>Mixed; see rows</w:t>
             </w:r>
           </w:p>
         </w:tc>
@@ -14638,6 +15089,7 @@
               <w:rPr>
                 <w:sz w:val="14"/>
               </w:rPr>
+              <w:t>Mixed; see rows</w:t>
             </w:r>
           </w:p>
         </w:tc>
@@ -14654,6 +15106,7 @@
               <w:rPr>
                 <w:sz w:val="14"/>
               </w:rPr>
+              <w:t>Turbo3 P5 timeout</w:t>
             </w:r>
           </w:p>
         </w:tc>
@@ -14670,6 +15123,7 @@
               <w:rPr>
                 <w:sz w:val="14"/>
               </w:rPr>
+              <w:t>Q8_0 ranks marginally higher; scores are harsh critical-cap results, not precision-based assumptions</w:t>
             </w:r>
           </w:p>
         </w:tc>
@@ -15651,6 +16105,7 @@
               <w:rPr>
                 <w:sz w:val="14"/>
               </w:rPr>
+              <w:t>AB-I01</w:t>
             </w:r>
           </w:p>
         </w:tc>
@@ -15667,6 +16122,7 @@
               <w:rPr>
                 <w:sz w:val="14"/>
               </w:rPr>
+              <w:t>AB-B02/AB-B05</w:t>
             </w:r>
           </w:p>
         </w:tc>
@@ -15683,6 +16139,7 @@
               <w:rPr>
                 <w:sz w:val="14"/>
               </w:rPr>
+              <w:t>UI-BUNDLE-MISSING</w:t>
             </w:r>
           </w:p>
         </w:tc>
@@ -15699,6 +16156,7 @@
               <w:rPr>
                 <w:sz w:val="14"/>
               </w:rPr>
+              <w:t>Generated UI embed target lacked `loading.html`</w:t>
             </w:r>
           </w:p>
         </w:tc>
@@ -15715,6 +16173,7 @@
               <w:rPr>
                 <w:sz w:val="14"/>
               </w:rPr>
+              <w:t>Fork build always provisions UI despite `LLAMA_BUILD_UI=OFF`; downloaded bundle incomplete</w:t>
             </w:r>
           </w:p>
         </w:tc>
@@ -15731,6 +16190,7 @@
               <w:rPr>
                 <w:sz w:val="14"/>
               </w:rPr>
+              <w:t>Copied exact pinned source file into each generated build `tools/ui/dist`, hash-checked, then resumed</w:t>
             </w:r>
           </w:p>
         </w:tc>
@@ -15747,6 +16207,7 @@
               <w:rPr>
                 <w:sz w:val="14"/>
               </w:rPr>
+              <w:t>Yes</w:t>
             </w:r>
           </w:p>
         </w:tc>
@@ -15763,6 +16224,7 @@
               <w:rPr>
                 <w:sz w:val="14"/>
               </w:rPr>
+              <w:t>`build-cpu/` and `build-vulkan/` logs</w:t>
             </w:r>
           </w:p>
         </w:tc>
@@ -15785,6 +16247,7 @@
               <w:rPr>
                 <w:sz w:val="14"/>
               </w:rPr>
+              <w:t>AB-I02</w:t>
             </w:r>
           </w:p>
         </w:tc>
@@ -15802,6 +16265,7 @@
               <w:rPr>
                 <w:sz w:val="14"/>
               </w:rPr>
+              <w:t>AB-B04</w:t>
             </w:r>
           </w:p>
         </w:tc>
@@ -15819,6 +16283,7 @@
               <w:rPr>
                 <w:sz w:val="14"/>
               </w:rPr>
+              <w:t>DEVICE-GUARD-4551</w:t>
             </w:r>
           </w:p>
         </w:tc>
@@ -15836,6 +16301,7 @@
               <w:rPr>
                 <w:sz w:val="14"/>
               </w:rPr>
+              <w:t>`test-barrier.exe` cannot launch</w:t>
             </w:r>
           </w:p>
         </w:tc>
@@ -15853,6 +16319,7 @@
               <w:rPr>
                 <w:sz w:val="14"/>
               </w:rPr>
+              <w:t>Windows Device Guard content policy; renamed binary and dependency audit gave same result</w:t>
             </w:r>
           </w:p>
         </w:tc>
@@ -15870,6 +16337,7 @@
               <w:rPr>
                 <w:sz w:val="14"/>
               </w:rPr>
+              <w:t>Classified external-policy blocked; 42 other repository tests effective-pass</w:t>
             </w:r>
           </w:p>
         </w:tc>
@@ -15887,6 +16355,7 @@
               <w:rPr>
                 <w:sz w:val="14"/>
               </w:rPr>
+              <w:t>No - external policy</w:t>
             </w:r>
           </w:p>
         </w:tc>
@@ -15904,6 +16373,7 @@
               <w:rPr>
                 <w:sz w:val="14"/>
               </w:rPr>
+              <w:t>`build-cpu/ctest*` and `acquisition/results/AtomicBot_Failure_Log.json`</w:t>
             </w:r>
           </w:p>
         </w:tc>
@@ -15925,6 +16395,7 @@
               <w:rPr>
                 <w:sz w:val="14"/>
               </w:rPr>
+              <w:t>AB-I03</w:t>
             </w:r>
           </w:p>
         </w:tc>
@@ -15941,6 +16412,7 @@
               <w:rPr>
                 <w:sz w:val="14"/>
               </w:rPr>
+              <w:t>AB-08Q</w:t>
             </w:r>
           </w:p>
         </w:tc>
@@ -15957,6 +16429,7 @@
               <w:rPr>
                 <w:sz w:val="14"/>
               </w:rPr>
+              <w:t>MEMORY-GUARD</w:t>
             </w:r>
           </w:p>
         </w:tc>
@@ -15973,6 +16446,7 @@
               <w:rPr>
                 <w:sz w:val="14"/>
               </w:rPr>
+              <w:t>Initial 8B Q8_0 batch stopped at 470.7 MiB free</w:t>
             </w:r>
           </w:p>
         </w:tc>
@@ -15989,6 +16463,7 @@
               <w:rPr>
                 <w:sz w:val="14"/>
               </w:rPr>
+              <w:t>Earlier 8B work left insufficient shared memory</w:t>
             </w:r>
           </w:p>
         </w:tc>
@@ -16005,6 +16480,7 @@
               <w:rPr>
                 <w:sz w:val="14"/>
               </w:rPr>
+              <w:t>Isolated rerun from idle passed pilot, warm-up and all three samples</w:t>
             </w:r>
           </w:p>
         </w:tc>
@@ -16021,6 +16497,7 @@
               <w:rPr>
                 <w:sz w:val="14"/>
               </w:rPr>
+              <w:t>Yes</w:t>
             </w:r>
           </w:p>
         </w:tc>
@@ -16037,6 +16514,7 @@
               <w:rPr>
                 <w:sz w:val="14"/>
               </w:rPr>
+              <w:t>`acquisition/logs/AB-08Q/`</w:t>
             </w:r>
           </w:p>
         </w:tc>
@@ -16059,6 +16537,7 @@
               <w:rPr>
                 <w:sz w:val="14"/>
               </w:rPr>
+              <w:t>AB-I04</w:t>
             </w:r>
           </w:p>
         </w:tc>
@@ -16076,6 +16555,7 @@
               <w:rPr>
                 <w:sz w:val="14"/>
               </w:rPr>
+              <w:t>AB-KV8-F16-4K/AB-15M</w:t>
             </w:r>
           </w:p>
         </w:tc>
@@ -16093,6 +16573,7 @@
               <w:rPr>
                 <w:sz w:val="14"/>
               </w:rPr>
+              <w:t>SAFETY-GATE</w:t>
             </w:r>
           </w:p>
         </w:tc>
@@ -16110,6 +16591,7 @@
               <w:rPr>
                 <w:sz w:val="14"/>
               </w:rPr>
+              <w:t>High-risk 8B F16/full-Vulkan rows not executed</w:t>
             </w:r>
           </w:p>
         </w:tc>
@@ -16127,6 +16609,7 @@
               <w:rPr>
                 <w:sz w:val="14"/>
               </w:rPr>
+              <w:t>16 GB shared-memory ceiling and prior matched-class low-memory evidence</w:t>
             </w:r>
           </w:p>
         </w:tc>
@@ -16144,6 +16627,7 @@
               <w:rPr>
                 <w:sz w:val="14"/>
               </w:rPr>
+              <w:t>Retained as Blocked, not unsupported or passed</w:t>
             </w:r>
           </w:p>
         </w:tc>
@@ -16161,6 +16645,7 @@
               <w:rPr>
                 <w:sz w:val="14"/>
               </w:rPr>
+              <w:t>No - intentional</w:t>
             </w:r>
           </w:p>
         </w:tc>
@@ -16178,6 +16663,148 @@
               <w:rPr>
                 <w:sz w:val="14"/>
               </w:rPr>
+              <w:t>`acquisition/results/AtomicBot_Master_Summary.json`</w:t>
+            </w:r>
+          </w:p>
+        </w:tc>
+      </w:tr>
+      <w:tr>
+        <w:trPr>
+          <w:cantSplit/>
+        </w:trPr>
+        <w:tc>
+          <w:tcPr>
+            <w:tcW w:type="dxa" w:w="1818"/>
+            <w:vAlign w:val="center"/>
+          </w:tcPr>
+          <w:p>
+            <w:pPr>
+              <w:spacing w:after="0"/>
+            </w:pPr>
+            <w:r>
+              <w:rPr>
+                <w:sz w:val="14"/>
+              </w:rPr>
+              <w:t>AB-I05</w:t>
+            </w:r>
+          </w:p>
+        </w:tc>
+        <w:tc>
+          <w:tcPr>
+            <w:tcW w:type="dxa" w:w="1818"/>
+            <w:vAlign w:val="center"/>
+          </w:tcPr>
+          <w:p>
+            <w:pPr>
+              <w:spacing w:after="0"/>
+            </w:pPr>
+            <w:r>
+              <w:rPr>
+                <w:sz w:val="14"/>
+              </w:rPr>
+              <w:t>Quality P5 turbo3</w:t>
+            </w:r>
+          </w:p>
+        </w:tc>
+        <w:tc>
+          <w:tcPr>
+            <w:tcW w:type="dxa" w:w="1818"/>
+            <w:vAlign w:val="center"/>
+          </w:tcPr>
+          <w:p>
+            <w:pPr>
+              <w:spacing w:after="0"/>
+            </w:pPr>
+            <w:r>
+              <w:rPr>
+                <w:sz w:val="14"/>
+              </w:rPr>
+              <w:t>QUALITY-TIMEOUT-2400</w:t>
+            </w:r>
+          </w:p>
+        </w:tc>
+        <w:tc>
+          <w:tcPr>
+            <w:tcW w:type="dxa" w:w="1818"/>
+            <w:vAlign w:val="center"/>
+          </w:tcPr>
+          <w:p>
+            <w:pPr>
+              <w:spacing w:after="0"/>
+            </w:pPr>
+            <w:r>
+              <w:rPr>
+                <w:sz w:val="14"/>
+              </w:rPr>
+              <w:t>Turbo3 produced no P5 response within 2400 seconds</w:t>
+            </w:r>
+          </w:p>
+        </w:tc>
+        <w:tc>
+          <w:tcPr>
+            <w:tcW w:type="dxa" w:w="1818"/>
+            <w:vAlign w:val="center"/>
+          </w:tcPr>
+          <w:p>
+            <w:pPr>
+              <w:spacing w:after="0"/>
+            </w:pPr>
+            <w:r>
+              <w:rPr>
+                <w:sz w:val="14"/>
+              </w:rPr>
+              <w:t>8706-token frozen fixture is extremely slow on CPU Turbo3</w:t>
+            </w:r>
+          </w:p>
+        </w:tc>
+        <w:tc>
+          <w:tcPr>
+            <w:tcW w:type="dxa" w:w="1818"/>
+            <w:vAlign w:val="center"/>
+          </w:tcPr>
+          <w:p>
+            <w:pPr>
+              <w:spacing w:after="0"/>
+            </w:pPr>
+            <w:r>
+              <w:rPr>
+                <w:sz w:val="14"/>
+              </w:rPr>
+              <w:t>Empty output retained and scored 0; no truncation or substitution</w:t>
+            </w:r>
+          </w:p>
+        </w:tc>
+        <w:tc>
+          <w:tcPr>
+            <w:tcW w:type="dxa" w:w="1818"/>
+            <w:vAlign w:val="center"/>
+          </w:tcPr>
+          <w:p>
+            <w:pPr>
+              <w:spacing w:after="0"/>
+            </w:pPr>
+            <w:r>
+              <w:rPr>
+                <w:sz w:val="14"/>
+              </w:rPr>
+              <w:t>No</w:t>
+            </w:r>
+          </w:p>
+        </w:tc>
+        <w:tc>
+          <w:tcPr>
+            <w:tcW w:type="dxa" w:w="1818"/>
+            <w:vAlign w:val="center"/>
+          </w:tcPr>
+          <w:p>
+            <w:pPr>
+              <w:spacing w:after="0"/>
+            </w:pPr>
+            <w:r>
+              <w:rPr>
+                <w:sz w:val="14"/>
+              </w:rPr>
+              <w:t>`quality/configuration-B/P5.json`</w:t>
             </w:r>
           </w:p>
         </w:tc>
@@ -16281,6 +16908,7 @@
               <w:rPr>
                 <w:sz w:val="14"/>
               </w:rPr>
+              <w:t>Substantial partial: CPU reference paths and Vulkan placement work; specialised Vulkan Turbo3 FA shader generation is disabled at the tested source location</w:t>
             </w:r>
           </w:p>
         </w:tc>
@@ -16321,6 +16949,7 @@
               <w:rPr>
                 <w:sz w:val="14"/>
               </w:rPr>
+              <w:t>Generic backend presence is not proof of native TQ kernels; SYCL is not claimed and partial Vulkan rows retain CPU KV</w:t>
             </w:r>
           </w:p>
         </w:tc>
@@ -16359,6 +16988,7 @@
               <w:rPr>
                 <w:sz w:val="14"/>
               </w:rPr>
+              <w:t>Pass for runtime/memory; turbo3 uses 125 MiB versus 320 MiB F16 at 4K, but Q8_0 narrowly wins the controlled quality screen 6.67 to 6.64</w:t>
             </w:r>
           </w:p>
         </w:tc>
@@ -16399,6 +17029,7 @@
               <w:rPr>
                 <w:sz w:val="14"/>
               </w:rPr>
+              <w:t>Pass for CPU and partial Vulkan rows; matched F16 4K and full Vulkan remain safety-blocked</w:t>
             </w:r>
           </w:p>
         </w:tc>
@@ -16437,6 +17068,7 @@
               <w:rPr>
                 <w:sz w:val="14"/>
               </w:rPr>
+              <w:t>Q8_0 for conservative quality/throughput; turbo3 only when its 60.94% KV reduction is worth the measured quality and long-context latency risk</w:t>
             </w:r>
           </w:p>
         </w:tc>
@@ -16477,6 +17109,7 @@
               <w:rPr>
                 <w:sz w:val="14"/>
               </w:rPr>
+              <w:t>3B turbo3 full Vulkan is technically validated; partial turbo3 keeps KV on CPU and is hybrid, not native KV execution</w:t>
             </w:r>
           </w:p>
         </w:tc>
@@ -16515,6 +17148,7 @@
               <w:rPr>
                 <w:sz w:val="14"/>
               </w:rPr>
+              <w:t>3B turbo3: 125 versus 320 MiB KV (2.56x smaller, 60.94% reduction); 1B turbo3: 5.08 versus 26 MiB (80.46% reduction)</w:t>
             </w:r>
           </w:p>
         </w:tc>
@@ -16555,6 +17189,7 @@
               <w:rPr>
                 <w:sz w:val="14"/>
               </w:rPr>
+              <w:t>No unexplained fallback; partial runs intentionally used 1/41 GPU layers and CPU KV, while AB-13 placed 41/41 layers and KV on Vulkan0</w:t>
             </w:r>
           </w:p>
         </w:tc>
@@ -16593,6 +17228,7 @@
               <w:rPr>
                 <w:sz w:val="14"/>
               </w:rPr>
+              <w:t>Moderate/high on Windows: UI packaging repair, Vulkan toolchain ordering, Device Guard exception, and explicit memory gating required</w:t>
             </w:r>
           </w:p>
         </w:tc>
@@ -16633,6 +17269,7 @@
               <w:rPr>
                 <w:sz w:val="14"/>
               </w:rPr>
+              <w:t>Accepted with limitations</w:t>
             </w:r>
           </w:p>
         </w:tc>
@@ -16671,6 +17308,7 @@
               <w:rPr>
                 <w:sz w:val="14"/>
               </w:rPr>
+              <w:t>Experimental memory-saving option behind configuration/quality guardrails; not the unconditional default</w:t>
             </w:r>
           </w:p>
         </w:tc>
@@ -16711,6 +17349,7 @@
               <w:rPr>
                 <w:sz w:val="14"/>
               </w:rPr>
+              <w:t>`experiments/raw-results/atomicbot-turboquant/2026-07-16/`</w:t>
             </w:r>
           </w:p>
         </w:tc>
@@ -16749,6 +17388,7 @@
               <w:rPr>
                 <w:sz w:val="14"/>
               </w:rPr>
+              <w:t>Complete for controlled Q8_0 vs turbo3 P1-P6 screen; Q8_0 6.67, turbo3 6.64; P5 uses 16K context to fit the frozen 8706-token fixture</w:t>
             </w:r>
           </w:p>
         </w:tc>
@@ -16789,6 +17429,7 @@
               <w:rPr>
                 <w:sz w:val="14"/>
               </w:rPr>
+              <w:t>Runtime activation and material KV savings are proven, but lower Turbo3 quality, a 2400-second P5 timeout, hybrid fallback on partial Vulkan, untested guarded 8B extremes, and one policy-blocked repository test prevent an unrestricted recommendation.</w:t>
             </w:r>
           </w:p>
         </w:tc>

</xml_diff>

<commit_message>
test: complete guarded AtomicBot 8B retries
</commit_message>
<xml_diff>
--- a/docs/testing/workbooks/generated/02_AtomicBot_TurboQuant_Controlled_Retest_Workbook_v1.docx
+++ b/docs/testing/workbooks/generated/02_AtomicBot_TurboQuant_Controlled_Retest_Workbook_v1.docx
@@ -8,7 +8,7 @@
         <w:jc w:val="center"/>
       </w:pPr>
       <w:r>
-        <w:t>02 AtomicBot TurboQuant Controlled Retest Workbook v1.3</w:t>
+        <w:t>02 AtomicBot TurboQuant Controlled Retest Workbook v1.4</w:t>
       </w:r>
     </w:p>
     <w:p>
@@ -677,6 +677,130 @@
             <w:tcW w:type="dxa" w:w="2078"/>
             <w:vAlign w:val="center"/>
             <w:shd w:fill="EAF2F8"/>
+          </w:tcPr>
+          <w:p>
+            <w:pPr>
+              <w:spacing w:after="0"/>
+            </w:pPr>
+            <w:r>
+              <w:rPr>
+                <w:sz w:val="14"/>
+              </w:rPr>
+              <w:t>Superseded</w:t>
+            </w:r>
+          </w:p>
+        </w:tc>
+      </w:tr>
+      <w:tr>
+        <w:trPr>
+          <w:cantSplit/>
+        </w:trPr>
+        <w:tc>
+          <w:tcPr>
+            <w:tcW w:type="dxa" w:w="2078"/>
+            <w:vAlign w:val="center"/>
+          </w:tcPr>
+          <w:p>
+            <w:pPr>
+              <w:spacing w:after="0"/>
+            </w:pPr>
+            <w:r>
+              <w:rPr>
+                <w:sz w:val="14"/>
+              </w:rPr>
+              <w:t>1.4</w:t>
+            </w:r>
+          </w:p>
+        </w:tc>
+        <w:tc>
+          <w:tcPr>
+            <w:tcW w:type="dxa" w:w="2078"/>
+            <w:vAlign w:val="center"/>
+          </w:tcPr>
+          <w:p>
+            <w:pPr>
+              <w:spacing w:after="0"/>
+            </w:pPr>
+            <w:r>
+              <w:rPr>
+                <w:sz w:val="14"/>
+              </w:rPr>
+              <w:t>2026-07-16</w:t>
+            </w:r>
+          </w:p>
+        </w:tc>
+        <w:tc>
+          <w:tcPr>
+            <w:tcW w:type="dxa" w:w="2078"/>
+            <w:vAlign w:val="center"/>
+          </w:tcPr>
+          <w:p>
+            <w:pPr>
+              <w:spacing w:after="0"/>
+            </w:pPr>
+            <w:r>
+              <w:rPr>
+                <w:sz w:val="14"/>
+              </w:rPr>
+              <w:t>Student</w:t>
+            </w:r>
+          </w:p>
+        </w:tc>
+        <w:tc>
+          <w:tcPr>
+            <w:tcW w:type="dxa" w:w="2078"/>
+            <w:vAlign w:val="center"/>
+          </w:tcPr>
+          <w:p>
+            <w:pPr>
+              <w:spacing w:after="0"/>
+            </w:pPr>
+            <w:r>
+              <w:rPr>
+                <w:sz w:val="14"/>
+              </w:rPr>
+              <w:t>Retried AB-KV8-F16-4K and AB-15M alone from an idle system with a 256 MiB emergency-stop floor; both completed pilot, warm-up and three measured repetitions without crossing the floor, filling the final two runtime rows.</w:t>
+            </w:r>
+          </w:p>
+        </w:tc>
+        <w:tc>
+          <w:tcPr>
+            <w:tcW w:type="dxa" w:w="2078"/>
+            <w:vAlign w:val="center"/>
+          </w:tcPr>
+          <w:p>
+            <w:pPr>
+              <w:spacing w:after="0"/>
+            </w:pPr>
+            <w:r>
+              <w:rPr>
+                <w:sz w:val="14"/>
+              </w:rPr>
+              <w:t>AB-KV8-F16-4K; AB-15M</w:t>
+            </w:r>
+          </w:p>
+        </w:tc>
+        <w:tc>
+          <w:tcPr>
+            <w:tcW w:type="dxa" w:w="2078"/>
+            <w:vAlign w:val="center"/>
+          </w:tcPr>
+          <w:p>
+            <w:pPr>
+              <w:spacing w:after="0"/>
+            </w:pPr>
+            <w:r>
+              <w:rPr>
+                <w:sz w:val="14"/>
+              </w:rPr>
+              <w:t>testing/atomicbot-turboquant-formal-retest; Pending PR; Pending merge</w:t>
+            </w:r>
+          </w:p>
+        </w:tc>
+        <w:tc>
+          <w:tcPr>
+            <w:tcW w:type="dxa" w:w="2078"/>
+            <w:vAlign w:val="center"/>
           </w:tcPr>
           <w:p>
             <w:pPr>
@@ -772,7 +896,7 @@
         <w:spacing w:after="60"/>
       </w:pPr>
       <w:r>
-        <w:t>Controlled retest template v1.3. Historical results were removed from this working copy; the original source document is preserved under docs/testing/source-material/original-workbooks/.</w:t>
+        <w:t>Controlled retest template v1.4. Historical results were removed from this working copy; the original source document is preserved under docs/testing/source-material/original-workbooks/.</w:t>
       </w:r>
     </w:p>
     <w:p>
@@ -1364,7 +1488,7 @@
               <w:rPr>
                 <w:sz w:val="14"/>
               </w:rPr>
-              <w:t>Accepted with limitations: 17 formal runtime rows passed; two guarded 8B rows blocked; one repository test blocked by Device Guard</w:t>
+              <w:t>Accepted with limitations: all 19 runtime rows passed, including controlled safety-gate bypasses; one repository test remains blocked by Device Guard</w:t>
             </w:r>
           </w:p>
         </w:tc>
@@ -4255,7 +4379,7 @@
               <w:rPr>
                 <w:sz w:val="14"/>
               </w:rPr>
-              <w:t>Blocked - safety gate</w:t>
+              <w:t>Pass - controlled bypass</w:t>
             </w:r>
           </w:p>
         </w:tc>
@@ -5399,7 +5523,7 @@
               <w:rPr>
                 <w:sz w:val="14"/>
               </w:rPr>
-              <w:t>Blocked - safety gate</w:t>
+              <w:t>Pass - controlled bypass; 41/41 layers</w:t>
             </w:r>
           </w:p>
         </w:tc>
@@ -5415,7 +5539,7 @@
         <w:spacing w:after="60"/>
       </w:pPr>
       <w:r>
-        <w:t>AB-KV8-F16-4K and AB-15M are research-only because of the 16 GB shared-memory ceiling. A test not run because of a safety gate is `Blocked` or `Not run`, not evidence that the backend is unsupported.</w:t>
+        <w:t>AB-KV8-F16-4K and AB-15M began as research-only because of the 16 GB shared-memory ceiling. They were later executed alone from an idle system with a 256 MiB emergency-stop floor; both passed without crossing the floor. This bypass does not make concurrent or unattended execution safe.</w:t>
       </w:r>
     </w:p>
     <w:p>
@@ -6564,7 +6688,7 @@
               <w:rPr>
                 <w:sz w:val="14"/>
               </w:rPr>
-              <w:t>Partial</w:t>
+              <w:t>Yes with high-memory controls</w:t>
             </w:r>
           </w:p>
         </w:tc>
@@ -6582,7 +6706,7 @@
               <w:rPr>
                 <w:sz w:val="14"/>
               </w:rPr>
-              <w:t>Yes, partial only; full blocked</w:t>
+              <w:t>Yes; partial and full bypass validated serially</w:t>
             </w:r>
           </w:p>
         </w:tc>
@@ -7753,7 +7877,7 @@
               <w:rPr>
                 <w:sz w:val="14"/>
               </w:rPr>
-              <w:t>Not run</w:t>
+              <w:t>Intel UHD Vulkan0</w:t>
             </w:r>
           </w:p>
         </w:tc>
@@ -7771,7 +7895,7 @@
               <w:rPr>
                 <w:sz w:val="14"/>
               </w:rPr>
-              <w:t>Blocked</w:t>
+              <w:t>Vulkan native placement</w:t>
             </w:r>
           </w:p>
         </w:tc>
@@ -7789,7 +7913,7 @@
               <w:rPr>
                 <w:sz w:val="14"/>
               </w:rPr>
-              <w:t>N/A; 16 GB shared-memory safety gate</w:t>
+              <w:t>41/41 layers; 4876.27 MiB model and 95.01 MiB compute buffers on Vulkan0</w:t>
             </w:r>
           </w:p>
         </w:tc>
@@ -7807,7 +7931,7 @@
               <w:rPr>
                 <w:sz w:val="14"/>
               </w:rPr>
-              <w:t>N/A - blocked</w:t>
+              <w:t>Vulkan0, 125.13 MiB</w:t>
             </w:r>
           </w:p>
         </w:tc>
@@ -7825,7 +7949,7 @@
               <w:rPr>
                 <w:sz w:val="14"/>
               </w:rPr>
-              <w:t>N/A - blocked</w:t>
+              <w:t>No unexplained fallback</w:t>
             </w:r>
           </w:p>
         </w:tc>
@@ -7843,7 +7967,7 @@
               <w:rPr>
                 <w:sz w:val="14"/>
               </w:rPr>
-              <w:t>N/A - blocked</w:t>
+              <w:t>N/A - not sampled in bypass collector</w:t>
             </w:r>
           </w:p>
         </w:tc>
@@ -7861,7 +7985,7 @@
               <w:rPr>
                 <w:sz w:val="14"/>
               </w:rPr>
-              <w:t>N/A - blocked</w:t>
+              <w:t>N/A - counter unavailable</w:t>
             </w:r>
           </w:p>
         </w:tc>
@@ -7879,7 +8003,7 @@
               <w:rPr>
                 <w:sz w:val="14"/>
               </w:rPr>
-              <w:t>`acquisition/results/AtomicBot_Master_Summary.json`</w:t>
+              <w:t>`safety-bypass/AB-15M/`</w:t>
             </w:r>
           </w:p>
         </w:tc>
@@ -10385,7 +10509,7 @@
               <w:rPr>
                 <w:sz w:val="14"/>
               </w:rPr>
-              <w:t>Blocked</w:t>
+              <w:t>9235.957</w:t>
             </w:r>
           </w:p>
         </w:tc>
@@ -10403,7 +10527,7 @@
               <w:rPr>
                 <w:sz w:val="14"/>
               </w:rPr>
-              <w:t>Blocked</w:t>
+              <w:t>640.00</w:t>
             </w:r>
           </w:p>
         </w:tc>
@@ -10421,7 +10545,7 @@
               <w:rPr>
                 <w:sz w:val="14"/>
               </w:rPr>
-              <w:t>Blocked</w:t>
+              <w:t>334.844</w:t>
             </w:r>
           </w:p>
         </w:tc>
@@ -10439,7 +10563,7 @@
               <w:rPr>
                 <w:sz w:val="14"/>
               </w:rPr>
-              <w:t>Blocked</w:t>
+              <w:t>8.37</w:t>
             </w:r>
           </w:p>
         </w:tc>
@@ -10457,7 +10581,7 @@
               <w:rPr>
                 <w:sz w:val="14"/>
               </w:rPr>
-              <w:t>N/A - safety gate</w:t>
+              <w:t>N/A - not quality-screened</w:t>
             </w:r>
           </w:p>
         </w:tc>
@@ -10475,7 +10599,7 @@
               <w:rPr>
                 <w:sz w:val="14"/>
               </w:rPr>
-              <w:t>Blocked - memory gate</w:t>
+              <w:t>Pass - controlled bypass</w:t>
             </w:r>
           </w:p>
         </w:tc>
@@ -12476,7 +12600,7 @@
               <w:rPr>
                 <w:sz w:val="14"/>
               </w:rPr>
-              <w:t>Blocked</w:t>
+              <w:t>10455.605</w:t>
             </w:r>
           </w:p>
         </w:tc>
@@ -12493,7 +12617,7 @@
               <w:rPr>
                 <w:sz w:val="14"/>
               </w:rPr>
-              <w:t>Blocked</w:t>
+              <w:t>125.00</w:t>
             </w:r>
           </w:p>
         </w:tc>
@@ -12510,7 +12634,7 @@
               <w:rPr>
                 <w:sz w:val="14"/>
               </w:rPr>
-              <w:t>Blocked</w:t>
+              <w:t>637.928</w:t>
             </w:r>
           </w:p>
         </w:tc>
@@ -12527,7 +12651,7 @@
               <w:rPr>
                 <w:sz w:val="14"/>
               </w:rPr>
-              <w:t>Blocked</w:t>
+              <w:t>4.19</w:t>
             </w:r>
           </w:p>
         </w:tc>
@@ -12544,7 +12668,7 @@
               <w:rPr>
                 <w:sz w:val="14"/>
               </w:rPr>
-              <w:t>N/A - safety gate</w:t>
+              <w:t>N/A - not quality-screened</w:t>
             </w:r>
           </w:p>
         </w:tc>
@@ -12561,7 +12685,7 @@
               <w:rPr>
                 <w:sz w:val="14"/>
               </w:rPr>
-              <w:t>Blocked - memory gate</w:t>
+              <w:t>Pass - controlled bypass</w:t>
             </w:r>
           </w:p>
         </w:tc>
@@ -13286,7 +13410,7 @@
               <w:rPr>
                 <w:sz w:val="14"/>
               </w:rPr>
-              <w:t>Blocked</w:t>
+              <w:t>640.00</w:t>
             </w:r>
           </w:p>
         </w:tc>
@@ -13322,7 +13446,7 @@
               <w:rPr>
                 <w:sz w:val="14"/>
               </w:rPr>
-              <w:t>N/A</w:t>
+              <w:t>3.765x</w:t>
             </w:r>
           </w:p>
         </w:tc>
@@ -13340,7 +13464,7 @@
               <w:rPr>
                 <w:sz w:val="14"/>
               </w:rPr>
-              <w:t>N/A</w:t>
+              <w:t>73.44%</w:t>
             </w:r>
           </w:p>
         </w:tc>
@@ -13358,7 +13482,7 @@
               <w:rPr>
                 <w:sz w:val="14"/>
               </w:rPr>
-              <w:t>Matched 8B F16 4K reference blocked by safety gate; no ratio claimed</w:t>
+              <w:t>Direct matched 4K allocation reduction after isolated F16 safety-gate bypass</w:t>
             </w:r>
           </w:p>
         </w:tc>
@@ -13397,7 +13521,7 @@
               <w:rPr>
                 <w:sz w:val="14"/>
               </w:rPr>
-              <w:t>Blocked</w:t>
+              <w:t>640.00</w:t>
             </w:r>
           </w:p>
         </w:tc>
@@ -13431,7 +13555,7 @@
               <w:rPr>
                 <w:sz w:val="14"/>
               </w:rPr>
-              <w:t>N/A</w:t>
+              <w:t>5.120x</w:t>
             </w:r>
           </w:p>
         </w:tc>
@@ -13448,7 +13572,7 @@
               <w:rPr>
                 <w:sz w:val="14"/>
               </w:rPr>
-              <w:t>N/A</w:t>
+              <w:t>80.47%</w:t>
             </w:r>
           </w:p>
         </w:tc>
@@ -13465,7 +13589,7 @@
               <w:rPr>
                 <w:sz w:val="14"/>
               </w:rPr>
-              <w:t>Matched 8B F16 4K reference blocked by safety gate; no ratio claimed</w:t>
+              <w:t>Direct matched 4K allocation reduction after isolated F16 safety-gate bypass</w:t>
             </w:r>
           </w:p>
         </w:tc>
@@ -16591,7 +16715,7 @@
               <w:rPr>
                 <w:sz w:val="14"/>
               </w:rPr>
-              <w:t>High-risk 8B F16/full-Vulkan rows not executed</w:t>
+              <w:t>Initial preventive gate blocked high-risk 8B F16/full-Vulkan rows</w:t>
             </w:r>
           </w:p>
         </w:tc>
@@ -16627,7 +16751,7 @@
               <w:rPr>
                 <w:sz w:val="14"/>
               </w:rPr>
-              <w:t>Retained as Blocked, not unsupported or passed</w:t>
+              <w:t>Retried serially from idle with 256 MiB emergency floor; pilot, warm-up and three samples passed for both without emergency stop</w:t>
             </w:r>
           </w:p>
         </w:tc>
@@ -16645,7 +16769,7 @@
               <w:rPr>
                 <w:sz w:val="14"/>
               </w:rPr>
-              <w:t>No - intentional</w:t>
+              <w:t>Yes</w:t>
             </w:r>
           </w:p>
         </w:tc>
@@ -16663,7 +16787,7 @@
               <w:rPr>
                 <w:sz w:val="14"/>
               </w:rPr>
-              <w:t>`acquisition/results/AtomicBot_Master_Summary.json`</w:t>
+              <w:t>`safety-bypass/`</w:t>
             </w:r>
           </w:p>
         </w:tc>
@@ -17029,7 +17153,7 @@
               <w:rPr>
                 <w:sz w:val="14"/>
               </w:rPr>
-              <w:t>Pass for CPU and partial Vulkan rows; matched F16 4K and full Vulkan remain safety-blocked</w:t>
+              <w:t>Pass for CPU, partial Vulkan and full Vulkan rows; guarded extremes passed only under isolated serial execution with an emergency memory floor</w:t>
             </w:r>
           </w:p>
         </w:tc>
@@ -17109,7 +17233,7 @@
               <w:rPr>
                 <w:sz w:val="14"/>
               </w:rPr>
-              <w:t>3B turbo3 full Vulkan is technically validated; partial turbo3 keeps KV on CPU and is hybrid, not native KV execution</w:t>
+              <w:t>turbo3 full Vulkan is technically validated for 3B and guarded 8B; partial turbo3 keeps KV on CPU and is hybrid, not native KV execution</w:t>
             </w:r>
           </w:p>
         </w:tc>
@@ -17148,7 +17272,7 @@
               <w:rPr>
                 <w:sz w:val="14"/>
               </w:rPr>
-              <w:t>3B turbo3: 125 versus 320 MiB KV (2.56x smaller, 60.94% reduction); 1B turbo3: 5.08 versus 26 MiB (80.46% reduction)</w:t>
+              <w:t>8B turbo3: 125 versus 640 MiB KV (5.12x smaller, 80.47% reduction); 3B turbo3: 125 versus 320 MiB (60.94%); 1B turbo3: 5.08 versus 26 MiB (80.46%)</w:t>
             </w:r>
           </w:p>
         </w:tc>
@@ -17429,7 +17553,7 @@
               <w:rPr>
                 <w:sz w:val="14"/>
               </w:rPr>
-              <w:t>Runtime activation and material KV savings are proven, but lower Turbo3 quality, a 2400-second P5 timeout, hybrid fallback on partial Vulkan, untested guarded 8B extremes, and one policy-blocked repository test prevent an unrestricted recommendation.</w:t>
+              <w:t>Runtime activation, material KV savings and both guarded 8B extremes are proven under controlled bypass. Lower Turbo3 quality, a 2400-second P5 timeout, hybrid placement on partial Vulkan, high 10.46 GiB full-8B working set, and one policy-blocked repository test still prevent an unrestricted recommendation.</w:t>
             </w:r>
           </w:p>
         </w:tc>

</xml_diff>